<commit_message>
feat: integrasi GAS, perbaikan tampilan baris surat, urutan nomor & klasifikasi terbaru, pisah kolom berkas SK, dan data lengkap surat 2026
</commit_message>
<xml_diff>
--- a/template/BAST.docx
+++ b/template/BAST.docx
@@ -178,6 +178,7 @@
           <w:lang w:val="da-DK"/>
         </w:rPr>
       </w:pPr>
+      <w:proofErr w:type="spellStart"/>
       <w:r>
         <w:rPr>
           <w:rFonts w:ascii="Bookman Old Style" w:eastAsia="Microsoft YaHei UI Light" w:hAnsi="Bookman Old Style" w:cs="Times New Roman"/>
@@ -185,8 +186,9 @@
           <w:szCs w:val="24"/>
           <w:lang w:val="da-DK"/>
         </w:rPr>
-        <w:t xml:space="preserve">Pada hari ini </w:t>
-      </w:r>
+        <w:t>Pada</w:t>
+      </w:r>
+      <w:proofErr w:type="spellEnd"/>
       <w:r>
         <w:rPr>
           <w:rFonts w:ascii="Bookman Old Style" w:eastAsia="Microsoft YaHei UI Light" w:hAnsi="Bookman Old Style" w:cs="Times New Roman"/>
@@ -194,8 +196,59 @@
           <w:szCs w:val="24"/>
           <w:lang w:val="da-DK"/>
         </w:rPr>
+        <w:t xml:space="preserve"> </w:t>
+      </w:r>
+      <w:proofErr w:type="spellStart"/>
+      <w:r>
+        <w:rPr>
+          <w:rFonts w:ascii="Bookman Old Style" w:eastAsia="Microsoft YaHei UI Light" w:hAnsi="Bookman Old Style" w:cs="Times New Roman"/>
+          <w:sz w:val="24"/>
+          <w:szCs w:val="24"/>
+          <w:lang w:val="da-DK"/>
+        </w:rPr>
+        <w:t>hari</w:t>
+      </w:r>
+      <w:proofErr w:type="spellEnd"/>
+      <w:r>
+        <w:rPr>
+          <w:rFonts w:ascii="Bookman Old Style" w:eastAsia="Microsoft YaHei UI Light" w:hAnsi="Bookman Old Style" w:cs="Times New Roman"/>
+          <w:sz w:val="24"/>
+          <w:szCs w:val="24"/>
+          <w:lang w:val="da-DK"/>
+        </w:rPr>
+        <w:t xml:space="preserve"> </w:t>
+      </w:r>
+      <w:proofErr w:type="spellStart"/>
+      <w:r>
+        <w:rPr>
+          <w:rFonts w:ascii="Bookman Old Style" w:eastAsia="Microsoft YaHei UI Light" w:hAnsi="Bookman Old Style" w:cs="Times New Roman"/>
+          <w:sz w:val="24"/>
+          <w:szCs w:val="24"/>
+          <w:lang w:val="da-DK"/>
+        </w:rPr>
+        <w:t>ini</w:t>
+      </w:r>
+      <w:proofErr w:type="spellEnd"/>
+      <w:r>
+        <w:rPr>
+          <w:rFonts w:ascii="Bookman Old Style" w:eastAsia="Microsoft YaHei UI Light" w:hAnsi="Bookman Old Style" w:cs="Times New Roman"/>
+          <w:sz w:val="24"/>
+          <w:szCs w:val="24"/>
+          <w:lang w:val="da-DK"/>
+        </w:rPr>
+        <w:t xml:space="preserve"> </w:t>
+      </w:r>
+      <w:proofErr w:type="spellStart"/>
+      <w:r>
+        <w:rPr>
+          <w:rFonts w:ascii="Bookman Old Style" w:eastAsia="Microsoft YaHei UI Light" w:hAnsi="Bookman Old Style" w:cs="Times New Roman"/>
+          <w:sz w:val="24"/>
+          <w:szCs w:val="24"/>
+          <w:lang w:val="da-DK"/>
+        </w:rPr>
         <w:t>senin</w:t>
       </w:r>
+      <w:proofErr w:type="spellEnd"/>
       <w:r>
         <w:rPr>
           <w:rFonts w:ascii="Bookman Old Style" w:eastAsia="Microsoft YaHei UI Light" w:hAnsi="Bookman Old Style" w:cs="Times New Roman"/>
@@ -214,6 +267,7 @@
         </w:rPr>
         <w:t xml:space="preserve"> tanggal </w:t>
       </w:r>
+      <w:proofErr w:type="spellStart"/>
       <w:r>
         <w:rPr>
           <w:rFonts w:ascii="Bookman Old Style" w:eastAsia="Microsoft YaHei UI Light" w:hAnsi="Bookman Old Style" w:cs="Times New Roman"/>
@@ -221,8 +275,9 @@
           <w:szCs w:val="24"/>
           <w:lang w:val="da-DK"/>
         </w:rPr>
-        <w:t xml:space="preserve">dua puluh bulan juli </w:t>
-      </w:r>
+        <w:t>dua</w:t>
+      </w:r>
+      <w:proofErr w:type="spellEnd"/>
       <w:r>
         <w:rPr>
           <w:rFonts w:ascii="Bookman Old Style" w:eastAsia="Microsoft YaHei UI Light" w:hAnsi="Bookman Old Style" w:cs="Times New Roman"/>
@@ -230,8 +285,9 @@
           <w:szCs w:val="24"/>
           <w:lang w:val="da-DK"/>
         </w:rPr>
-        <w:t xml:space="preserve">tahun </w:t>
-      </w:r>
+        <w:t xml:space="preserve"> </w:t>
+      </w:r>
+      <w:proofErr w:type="spellStart"/>
       <w:r>
         <w:rPr>
           <w:rFonts w:ascii="Bookman Old Style" w:eastAsia="Microsoft YaHei UI Light" w:hAnsi="Bookman Old Style" w:cs="Times New Roman"/>
@@ -239,8 +295,9 @@
           <w:szCs w:val="24"/>
           <w:lang w:val="da-DK"/>
         </w:rPr>
-        <w:t xml:space="preserve">dua ribu </w:t>
-      </w:r>
+        <w:t>puluh</w:t>
+      </w:r>
+      <w:proofErr w:type="spellEnd"/>
       <w:r>
         <w:rPr>
           <w:rFonts w:ascii="Bookman Old Style" w:eastAsia="Microsoft YaHei UI Light" w:hAnsi="Bookman Old Style" w:cs="Times New Roman"/>
@@ -248,8 +305,9 @@
           <w:szCs w:val="24"/>
           <w:lang w:val="da-DK"/>
         </w:rPr>
-        <w:t xml:space="preserve">dua </w:t>
-      </w:r>
+        <w:t xml:space="preserve"> </w:t>
+      </w:r>
+      <w:proofErr w:type="spellStart"/>
       <w:r>
         <w:rPr>
           <w:rFonts w:ascii="Bookman Old Style" w:eastAsia="Microsoft YaHei UI Light" w:hAnsi="Bookman Old Style" w:cs="Times New Roman"/>
@@ -257,8 +315,9 @@
           <w:szCs w:val="24"/>
           <w:lang w:val="da-DK"/>
         </w:rPr>
-        <w:t xml:space="preserve">puluh enam </w:t>
-      </w:r>
+        <w:t>bulan</w:t>
+      </w:r>
+      <w:proofErr w:type="spellEnd"/>
       <w:r>
         <w:rPr>
           <w:rFonts w:ascii="Bookman Old Style" w:eastAsia="Microsoft YaHei UI Light" w:hAnsi="Bookman Old Style" w:cs="Times New Roman"/>
@@ -266,6 +325,135 @@
           <w:szCs w:val="24"/>
           <w:lang w:val="da-DK"/>
         </w:rPr>
+        <w:t xml:space="preserve"> juli </w:t>
+      </w:r>
+      <w:proofErr w:type="spellStart"/>
+      <w:r>
+        <w:rPr>
+          <w:rFonts w:ascii="Bookman Old Style" w:eastAsia="Microsoft YaHei UI Light" w:hAnsi="Bookman Old Style" w:cs="Times New Roman"/>
+          <w:sz w:val="24"/>
+          <w:szCs w:val="24"/>
+          <w:lang w:val="da-DK"/>
+        </w:rPr>
+        <w:t>tahun</w:t>
+      </w:r>
+      <w:proofErr w:type="spellEnd"/>
+      <w:r>
+        <w:rPr>
+          <w:rFonts w:ascii="Bookman Old Style" w:eastAsia="Microsoft YaHei UI Light" w:hAnsi="Bookman Old Style" w:cs="Times New Roman"/>
+          <w:sz w:val="24"/>
+          <w:szCs w:val="24"/>
+          <w:lang w:val="da-DK"/>
+        </w:rPr>
+        <w:t xml:space="preserve"> </w:t>
+      </w:r>
+      <w:proofErr w:type="spellStart"/>
+      <w:r>
+        <w:rPr>
+          <w:rFonts w:ascii="Bookman Old Style" w:eastAsia="Microsoft YaHei UI Light" w:hAnsi="Bookman Old Style" w:cs="Times New Roman"/>
+          <w:sz w:val="24"/>
+          <w:szCs w:val="24"/>
+          <w:lang w:val="da-DK"/>
+        </w:rPr>
+        <w:t>dua</w:t>
+      </w:r>
+      <w:proofErr w:type="spellEnd"/>
+      <w:r>
+        <w:rPr>
+          <w:rFonts w:ascii="Bookman Old Style" w:eastAsia="Microsoft YaHei UI Light" w:hAnsi="Bookman Old Style" w:cs="Times New Roman"/>
+          <w:sz w:val="24"/>
+          <w:szCs w:val="24"/>
+          <w:lang w:val="da-DK"/>
+        </w:rPr>
+        <w:t xml:space="preserve"> </w:t>
+      </w:r>
+      <w:proofErr w:type="spellStart"/>
+      <w:r>
+        <w:rPr>
+          <w:rFonts w:ascii="Bookman Old Style" w:eastAsia="Microsoft YaHei UI Light" w:hAnsi="Bookman Old Style" w:cs="Times New Roman"/>
+          <w:sz w:val="24"/>
+          <w:szCs w:val="24"/>
+          <w:lang w:val="da-DK"/>
+        </w:rPr>
+        <w:t>ribu</w:t>
+      </w:r>
+      <w:proofErr w:type="spellEnd"/>
+      <w:r>
+        <w:rPr>
+          <w:rFonts w:ascii="Bookman Old Style" w:eastAsia="Microsoft YaHei UI Light" w:hAnsi="Bookman Old Style" w:cs="Times New Roman"/>
+          <w:sz w:val="24"/>
+          <w:szCs w:val="24"/>
+          <w:lang w:val="da-DK"/>
+        </w:rPr>
+        <w:t xml:space="preserve"> </w:t>
+      </w:r>
+      <w:proofErr w:type="spellStart"/>
+      <w:r>
+        <w:rPr>
+          <w:rFonts w:ascii="Bookman Old Style" w:eastAsia="Microsoft YaHei UI Light" w:hAnsi="Bookman Old Style" w:cs="Times New Roman"/>
+          <w:sz w:val="24"/>
+          <w:szCs w:val="24"/>
+          <w:lang w:val="da-DK"/>
+        </w:rPr>
+        <w:t>dua</w:t>
+      </w:r>
+      <w:proofErr w:type="spellEnd"/>
+      <w:r>
+        <w:rPr>
+          <w:rFonts w:ascii="Bookman Old Style" w:eastAsia="Microsoft YaHei UI Light" w:hAnsi="Bookman Old Style" w:cs="Times New Roman"/>
+          <w:sz w:val="24"/>
+          <w:szCs w:val="24"/>
+          <w:lang w:val="da-DK"/>
+        </w:rPr>
+        <w:t xml:space="preserve"> </w:t>
+      </w:r>
+      <w:proofErr w:type="spellStart"/>
+      <w:r>
+        <w:rPr>
+          <w:rFonts w:ascii="Bookman Old Style" w:eastAsia="Microsoft YaHei UI Light" w:hAnsi="Bookman Old Style" w:cs="Times New Roman"/>
+          <w:sz w:val="24"/>
+          <w:szCs w:val="24"/>
+          <w:lang w:val="da-DK"/>
+        </w:rPr>
+        <w:t>puluh</w:t>
+      </w:r>
+      <w:proofErr w:type="spellEnd"/>
+      <w:r>
+        <w:rPr>
+          <w:rFonts w:ascii="Bookman Old Style" w:eastAsia="Microsoft YaHei UI Light" w:hAnsi="Bookman Old Style" w:cs="Times New Roman"/>
+          <w:sz w:val="24"/>
+          <w:szCs w:val="24"/>
+          <w:lang w:val="da-DK"/>
+        </w:rPr>
+        <w:t xml:space="preserve"> </w:t>
+      </w:r>
+      <w:proofErr w:type="spellStart"/>
+      <w:r>
+        <w:rPr>
+          <w:rFonts w:ascii="Bookman Old Style" w:eastAsia="Microsoft YaHei UI Light" w:hAnsi="Bookman Old Style" w:cs="Times New Roman"/>
+          <w:sz w:val="24"/>
+          <w:szCs w:val="24"/>
+          <w:lang w:val="da-DK"/>
+        </w:rPr>
+        <w:t>enam</w:t>
+      </w:r>
+      <w:proofErr w:type="spellEnd"/>
+      <w:r>
+        <w:rPr>
+          <w:rFonts w:ascii="Bookman Old Style" w:eastAsia="Microsoft YaHei UI Light" w:hAnsi="Bookman Old Style" w:cs="Times New Roman"/>
+          <w:sz w:val="24"/>
+          <w:szCs w:val="24"/>
+          <w:lang w:val="da-DK"/>
+        </w:rPr>
+        <w:t xml:space="preserve"> </w:t>
+      </w:r>
+      <w:r>
+        <w:rPr>
+          <w:rFonts w:ascii="Bookman Old Style" w:eastAsia="Microsoft YaHei UI Light" w:hAnsi="Bookman Old Style" w:cs="Times New Roman"/>
+          <w:sz w:val="24"/>
+          <w:szCs w:val="24"/>
+          <w:lang w:val="da-DK"/>
+        </w:rPr>
         <w:t>(</w:t>
       </w:r>
       <w:r>
@@ -275,7 +463,27 @@
           <w:szCs w:val="24"/>
           <w:lang w:val="da-DK"/>
         </w:rPr>
-        <w:t>20-7-2026), bertempat di Benteng</w:t>
+        <w:t xml:space="preserve">20-7-2026), </w:t>
+      </w:r>
+      <w:proofErr w:type="spellStart"/>
+      <w:r>
+        <w:rPr>
+          <w:rFonts w:ascii="Bookman Old Style" w:eastAsia="Microsoft YaHei UI Light" w:hAnsi="Bookman Old Style" w:cs="Times New Roman"/>
+          <w:sz w:val="24"/>
+          <w:szCs w:val="24"/>
+          <w:lang w:val="da-DK"/>
+        </w:rPr>
+        <w:t>bertempat</w:t>
+      </w:r>
+      <w:proofErr w:type="spellEnd"/>
+      <w:r>
+        <w:rPr>
+          <w:rFonts w:ascii="Bookman Old Style" w:eastAsia="Microsoft YaHei UI Light" w:hAnsi="Bookman Old Style" w:cs="Times New Roman"/>
+          <w:sz w:val="24"/>
+          <w:szCs w:val="24"/>
+          <w:lang w:val="da-DK"/>
+        </w:rPr>
+        <w:t xml:space="preserve"> di Benteng</w:t>
       </w:r>
       <w:r>
         <w:rPr>
@@ -295,8 +503,9 @@
           <w:szCs w:val="24"/>
           <w:lang w:val="da-DK"/>
         </w:rPr>
-        <w:t xml:space="preserve"> kami </w:t>
-      </w:r>
+        <w:t xml:space="preserve"> </w:t>
+      </w:r>
+      <w:proofErr w:type="spellStart"/>
       <w:r>
         <w:rPr>
           <w:rFonts w:ascii="Bookman Old Style" w:eastAsia="Microsoft YaHei UI Light" w:hAnsi="Bookman Old Style" w:cs="Times New Roman"/>
@@ -304,8 +513,98 @@
           <w:szCs w:val="24"/>
           <w:lang w:val="da-DK"/>
         </w:rPr>
-        <w:t>yang bertanda tangan dibawah ini</w:t>
-      </w:r>
+        <w:t>kami</w:t>
+      </w:r>
+      <w:proofErr w:type="spellEnd"/>
+      <w:r>
+        <w:rPr>
+          <w:rFonts w:ascii="Bookman Old Style" w:eastAsia="Microsoft YaHei UI Light" w:hAnsi="Bookman Old Style" w:cs="Times New Roman"/>
+          <w:sz w:val="24"/>
+          <w:szCs w:val="24"/>
+          <w:lang w:val="da-DK"/>
+        </w:rPr>
+        <w:t xml:space="preserve"> </w:t>
+      </w:r>
+      <w:r>
+        <w:rPr>
+          <w:rFonts w:ascii="Bookman Old Style" w:eastAsia="Microsoft YaHei UI Light" w:hAnsi="Bookman Old Style" w:cs="Times New Roman"/>
+          <w:sz w:val="24"/>
+          <w:szCs w:val="24"/>
+          <w:lang w:val="da-DK"/>
+        </w:rPr>
+        <w:t xml:space="preserve">yang </w:t>
+      </w:r>
+      <w:proofErr w:type="spellStart"/>
+      <w:r>
+        <w:rPr>
+          <w:rFonts w:ascii="Bookman Old Style" w:eastAsia="Microsoft YaHei UI Light" w:hAnsi="Bookman Old Style" w:cs="Times New Roman"/>
+          <w:sz w:val="24"/>
+          <w:szCs w:val="24"/>
+          <w:lang w:val="da-DK"/>
+        </w:rPr>
+        <w:t>bertanda</w:t>
+      </w:r>
+      <w:proofErr w:type="spellEnd"/>
+      <w:r>
+        <w:rPr>
+          <w:rFonts w:ascii="Bookman Old Style" w:eastAsia="Microsoft YaHei UI Light" w:hAnsi="Bookman Old Style" w:cs="Times New Roman"/>
+          <w:sz w:val="24"/>
+          <w:szCs w:val="24"/>
+          <w:lang w:val="da-DK"/>
+        </w:rPr>
+        <w:t xml:space="preserve"> </w:t>
+      </w:r>
+      <w:proofErr w:type="spellStart"/>
+      <w:r>
+        <w:rPr>
+          <w:rFonts w:ascii="Bookman Old Style" w:eastAsia="Microsoft YaHei UI Light" w:hAnsi="Bookman Old Style" w:cs="Times New Roman"/>
+          <w:sz w:val="24"/>
+          <w:szCs w:val="24"/>
+          <w:lang w:val="da-DK"/>
+        </w:rPr>
+        <w:t>tangan</w:t>
+      </w:r>
+      <w:proofErr w:type="spellEnd"/>
+      <w:r>
+        <w:rPr>
+          <w:rFonts w:ascii="Bookman Old Style" w:eastAsia="Microsoft YaHei UI Light" w:hAnsi="Bookman Old Style" w:cs="Times New Roman"/>
+          <w:sz w:val="24"/>
+          <w:szCs w:val="24"/>
+          <w:lang w:val="da-DK"/>
+        </w:rPr>
+        <w:t xml:space="preserve"> </w:t>
+      </w:r>
+      <w:proofErr w:type="spellStart"/>
+      <w:r>
+        <w:rPr>
+          <w:rFonts w:ascii="Bookman Old Style" w:eastAsia="Microsoft YaHei UI Light" w:hAnsi="Bookman Old Style" w:cs="Times New Roman"/>
+          <w:sz w:val="24"/>
+          <w:szCs w:val="24"/>
+          <w:lang w:val="da-DK"/>
+        </w:rPr>
+        <w:t>dibawah</w:t>
+      </w:r>
+      <w:proofErr w:type="spellEnd"/>
+      <w:r>
+        <w:rPr>
+          <w:rFonts w:ascii="Bookman Old Style" w:eastAsia="Microsoft YaHei UI Light" w:hAnsi="Bookman Old Style" w:cs="Times New Roman"/>
+          <w:sz w:val="24"/>
+          <w:szCs w:val="24"/>
+          <w:lang w:val="da-DK"/>
+        </w:rPr>
+        <w:t xml:space="preserve"> </w:t>
+      </w:r>
+      <w:proofErr w:type="spellStart"/>
+      <w:r>
+        <w:rPr>
+          <w:rFonts w:ascii="Bookman Old Style" w:eastAsia="Microsoft YaHei UI Light" w:hAnsi="Bookman Old Style" w:cs="Times New Roman"/>
+          <w:sz w:val="24"/>
+          <w:szCs w:val="24"/>
+          <w:lang w:val="da-DK"/>
+        </w:rPr>
+        <w:t>ini</w:t>
+      </w:r>
+      <w:proofErr w:type="spellEnd"/>
       <w:r>
         <w:rPr>
           <w:rFonts w:ascii="Bookman Old Style" w:eastAsia="Microsoft YaHei UI Light" w:hAnsi="Bookman Old Style" w:cs="Times New Roman"/>
@@ -385,6 +684,7 @@
                 <w:lang w:val="da-DK"/>
               </w:rPr>
             </w:pPr>
+            <w:proofErr w:type="spellStart"/>
             <w:r>
               <w:rPr>
                 <w:rFonts w:ascii="Bookman Old Style" w:eastAsia="Microsoft YaHei UI Light" w:hAnsi="Bookman Old Style" w:cs="Times New Roman"/>
@@ -394,6 +694,7 @@
               </w:rPr>
               <w:t>Nama</w:t>
             </w:r>
+            <w:proofErr w:type="spellEnd"/>
           </w:p>
         </w:tc>
         <w:tc>
@@ -442,8 +743,19 @@
                 <w:szCs w:val="24"/>
                 <w:lang w:val="sv-SE"/>
               </w:rPr>
-              <w:t>SRI WAHYUNI, S.Si</w:t>
-            </w:r>
+              <w:t xml:space="preserve">SRI WAHYUNI, </w:t>
+            </w:r>
+            <w:proofErr w:type="spellStart"/>
+            <w:r>
+              <w:rPr>
+                <w:rFonts w:ascii="Bookman Old Style" w:eastAsia="Microsoft YaHei UI Light" w:hAnsi="Bookman Old Style" w:cs="Times New Roman"/>
+                <w:sz w:val="24"/>
+                <w:szCs w:val="24"/>
+                <w:lang w:val="sv-SE"/>
+              </w:rPr>
+              <w:t>S.Si</w:t>
+            </w:r>
+            <w:proofErr w:type="spellEnd"/>
           </w:p>
         </w:tc>
       </w:tr>
@@ -528,6 +840,7 @@
                 <w:lang w:val="da-DK"/>
               </w:rPr>
             </w:pPr>
+            <w:proofErr w:type="gramStart"/>
             <w:r>
               <w:rPr>
                 <w:rFonts w:ascii="Bookman Old Style" w:eastAsia="Microsoft YaHei UI Light" w:hAnsi="Bookman Old Style" w:cs="Times New Roman"/>
@@ -537,6 +850,7 @@
               </w:rPr>
               <w:t>198409292009022004</w:t>
             </w:r>
+            <w:proofErr w:type="gramEnd"/>
           </w:p>
         </w:tc>
       </w:tr>
@@ -571,6 +885,7 @@
                 <w:lang w:val="da-DK"/>
               </w:rPr>
             </w:pPr>
+            <w:proofErr w:type="spellStart"/>
             <w:r>
               <w:rPr>
                 <w:rFonts w:ascii="Bookman Old Style" w:eastAsia="Microsoft YaHei UI Light" w:hAnsi="Bookman Old Style" w:cs="Times New Roman"/>
@@ -580,6 +895,7 @@
               </w:rPr>
               <w:t>Jabatan</w:t>
             </w:r>
+            <w:proofErr w:type="spellEnd"/>
           </w:p>
         </w:tc>
         <w:tc>
@@ -621,6 +937,7 @@
                 <w:lang w:val="da-DK"/>
               </w:rPr>
             </w:pPr>
+            <w:proofErr w:type="spellStart"/>
             <w:r>
               <w:rPr>
                 <w:rFonts w:ascii="Bookman Old Style" w:eastAsia="Microsoft YaHei UI Light" w:hAnsi="Bookman Old Style" w:cs="Times New Roman"/>
@@ -628,8 +945,89 @@
                 <w:szCs w:val="24"/>
                 <w:lang w:val="sv-SE"/>
               </w:rPr>
-              <w:t>Ketua Tim Statistik Distribusi BPS Kabupaten Kepulauan Selayar</w:t>
-            </w:r>
+              <w:t>Ketua</w:t>
+            </w:r>
+            <w:proofErr w:type="spellEnd"/>
+            <w:r>
+              <w:rPr>
+                <w:rFonts w:ascii="Bookman Old Style" w:eastAsia="Microsoft YaHei UI Light" w:hAnsi="Bookman Old Style" w:cs="Times New Roman"/>
+                <w:sz w:val="24"/>
+                <w:szCs w:val="24"/>
+                <w:lang w:val="sv-SE"/>
+              </w:rPr>
+              <w:t xml:space="preserve"> Tim Statistik </w:t>
+            </w:r>
+            <w:proofErr w:type="spellStart"/>
+            <w:r>
+              <w:rPr>
+                <w:rFonts w:ascii="Bookman Old Style" w:eastAsia="Microsoft YaHei UI Light" w:hAnsi="Bookman Old Style" w:cs="Times New Roman"/>
+                <w:sz w:val="24"/>
+                <w:szCs w:val="24"/>
+                <w:lang w:val="sv-SE"/>
+              </w:rPr>
+              <w:t>Distribusi</w:t>
+            </w:r>
+            <w:proofErr w:type="spellEnd"/>
+            <w:r>
+              <w:rPr>
+                <w:rFonts w:ascii="Bookman Old Style" w:eastAsia="Microsoft YaHei UI Light" w:hAnsi="Bookman Old Style" w:cs="Times New Roman"/>
+                <w:sz w:val="24"/>
+                <w:szCs w:val="24"/>
+                <w:lang w:val="sv-SE"/>
+              </w:rPr>
+              <w:t xml:space="preserve"> BPS </w:t>
+            </w:r>
+            <w:proofErr w:type="spellStart"/>
+            <w:r>
+              <w:rPr>
+                <w:rFonts w:ascii="Bookman Old Style" w:eastAsia="Microsoft YaHei UI Light" w:hAnsi="Bookman Old Style" w:cs="Times New Roman"/>
+                <w:sz w:val="24"/>
+                <w:szCs w:val="24"/>
+                <w:lang w:val="sv-SE"/>
+              </w:rPr>
+              <w:t>Kabupaten</w:t>
+            </w:r>
+            <w:proofErr w:type="spellEnd"/>
+            <w:r>
+              <w:rPr>
+                <w:rFonts w:ascii="Bookman Old Style" w:eastAsia="Microsoft YaHei UI Light" w:hAnsi="Bookman Old Style" w:cs="Times New Roman"/>
+                <w:sz w:val="24"/>
+                <w:szCs w:val="24"/>
+                <w:lang w:val="sv-SE"/>
+              </w:rPr>
+              <w:t xml:space="preserve"> </w:t>
+            </w:r>
+            <w:proofErr w:type="spellStart"/>
+            <w:r>
+              <w:rPr>
+                <w:rFonts w:ascii="Bookman Old Style" w:eastAsia="Microsoft YaHei UI Light" w:hAnsi="Bookman Old Style" w:cs="Times New Roman"/>
+                <w:sz w:val="24"/>
+                <w:szCs w:val="24"/>
+                <w:lang w:val="sv-SE"/>
+              </w:rPr>
+              <w:t>Kepulauan</w:t>
+            </w:r>
+            <w:proofErr w:type="spellEnd"/>
+            <w:r>
+              <w:rPr>
+                <w:rFonts w:ascii="Bookman Old Style" w:eastAsia="Microsoft YaHei UI Light" w:hAnsi="Bookman Old Style" w:cs="Times New Roman"/>
+                <w:sz w:val="24"/>
+                <w:szCs w:val="24"/>
+                <w:lang w:val="sv-SE"/>
+              </w:rPr>
+              <w:t xml:space="preserve"> </w:t>
+            </w:r>
+            <w:proofErr w:type="spellStart"/>
+            <w:r>
+              <w:rPr>
+                <w:rFonts w:ascii="Bookman Old Style" w:eastAsia="Microsoft YaHei UI Light" w:hAnsi="Bookman Old Style" w:cs="Times New Roman"/>
+                <w:sz w:val="24"/>
+                <w:szCs w:val="24"/>
+                <w:lang w:val="sv-SE"/>
+              </w:rPr>
+              <w:t>Selayar</w:t>
+            </w:r>
+            <w:proofErr w:type="spellEnd"/>
           </w:p>
         </w:tc>
       </w:tr>
@@ -664,13 +1062,149 @@
                 <w:szCs w:val="24"/>
               </w:rPr>
             </w:pPr>
+            <w:proofErr w:type="spellStart"/>
             <w:r>
               <w:rPr>
                 <w:rFonts w:ascii="Bookman Old Style" w:eastAsia="Bookman Old Style" w:hAnsi="Bookman Old Style" w:cs="Times New Roman"/>
                 <w:sz w:val="24"/>
                 <w:szCs w:val="24"/>
               </w:rPr>
-              <w:t xml:space="preserve">bertindak untuk dan atas nama BPS Kabupaten Kepulauan Selayar, selanjutnya disebut sebagai </w:t>
+              <w:t>bertindak</w:t>
+            </w:r>
+            <w:proofErr w:type="spellEnd"/>
+            <w:r>
+              <w:rPr>
+                <w:rFonts w:ascii="Bookman Old Style" w:eastAsia="Bookman Old Style" w:hAnsi="Bookman Old Style" w:cs="Times New Roman"/>
+                <w:sz w:val="24"/>
+                <w:szCs w:val="24"/>
+              </w:rPr>
+              <w:t xml:space="preserve"> </w:t>
+            </w:r>
+            <w:proofErr w:type="spellStart"/>
+            <w:r>
+              <w:rPr>
+                <w:rFonts w:ascii="Bookman Old Style" w:eastAsia="Bookman Old Style" w:hAnsi="Bookman Old Style" w:cs="Times New Roman"/>
+                <w:sz w:val="24"/>
+                <w:szCs w:val="24"/>
+              </w:rPr>
+              <w:t>untuk</w:t>
+            </w:r>
+            <w:proofErr w:type="spellEnd"/>
+            <w:r>
+              <w:rPr>
+                <w:rFonts w:ascii="Bookman Old Style" w:eastAsia="Bookman Old Style" w:hAnsi="Bookman Old Style" w:cs="Times New Roman"/>
+                <w:sz w:val="24"/>
+                <w:szCs w:val="24"/>
+              </w:rPr>
+              <w:t xml:space="preserve"> dan </w:t>
+            </w:r>
+            <w:proofErr w:type="spellStart"/>
+            <w:r>
+              <w:rPr>
+                <w:rFonts w:ascii="Bookman Old Style" w:eastAsia="Bookman Old Style" w:hAnsi="Bookman Old Style" w:cs="Times New Roman"/>
+                <w:sz w:val="24"/>
+                <w:szCs w:val="24"/>
+              </w:rPr>
+              <w:t>atas</w:t>
+            </w:r>
+            <w:proofErr w:type="spellEnd"/>
+            <w:r>
+              <w:rPr>
+                <w:rFonts w:ascii="Bookman Old Style" w:eastAsia="Bookman Old Style" w:hAnsi="Bookman Old Style" w:cs="Times New Roman"/>
+                <w:sz w:val="24"/>
+                <w:szCs w:val="24"/>
+              </w:rPr>
+              <w:t xml:space="preserve"> nama BPS </w:t>
+            </w:r>
+            <w:proofErr w:type="spellStart"/>
+            <w:r>
+              <w:rPr>
+                <w:rFonts w:ascii="Bookman Old Style" w:eastAsia="Bookman Old Style" w:hAnsi="Bookman Old Style" w:cs="Times New Roman"/>
+                <w:sz w:val="24"/>
+                <w:szCs w:val="24"/>
+              </w:rPr>
+              <w:t>Kabupaten</w:t>
+            </w:r>
+            <w:proofErr w:type="spellEnd"/>
+            <w:r>
+              <w:rPr>
+                <w:rFonts w:ascii="Bookman Old Style" w:eastAsia="Bookman Old Style" w:hAnsi="Bookman Old Style" w:cs="Times New Roman"/>
+                <w:sz w:val="24"/>
+                <w:szCs w:val="24"/>
+              </w:rPr>
+              <w:t xml:space="preserve"> </w:t>
+            </w:r>
+            <w:proofErr w:type="spellStart"/>
+            <w:r>
+              <w:rPr>
+                <w:rFonts w:ascii="Bookman Old Style" w:eastAsia="Bookman Old Style" w:hAnsi="Bookman Old Style" w:cs="Times New Roman"/>
+                <w:sz w:val="24"/>
+                <w:szCs w:val="24"/>
+              </w:rPr>
+              <w:t>Kepulauan</w:t>
+            </w:r>
+            <w:proofErr w:type="spellEnd"/>
+            <w:r>
+              <w:rPr>
+                <w:rFonts w:ascii="Bookman Old Style" w:eastAsia="Bookman Old Style" w:hAnsi="Bookman Old Style" w:cs="Times New Roman"/>
+                <w:sz w:val="24"/>
+                <w:szCs w:val="24"/>
+              </w:rPr>
+              <w:t xml:space="preserve"> Selayar, </w:t>
+            </w:r>
+            <w:proofErr w:type="spellStart"/>
+            <w:r>
+              <w:rPr>
+                <w:rFonts w:ascii="Bookman Old Style" w:eastAsia="Bookman Old Style" w:hAnsi="Bookman Old Style" w:cs="Times New Roman"/>
+                <w:sz w:val="24"/>
+                <w:szCs w:val="24"/>
+              </w:rPr>
+              <w:t>selanjutnya</w:t>
+            </w:r>
+            <w:proofErr w:type="spellEnd"/>
+            <w:r>
+              <w:rPr>
+                <w:rFonts w:ascii="Bookman Old Style" w:eastAsia="Bookman Old Style" w:hAnsi="Bookman Old Style" w:cs="Times New Roman"/>
+                <w:sz w:val="24"/>
+                <w:szCs w:val="24"/>
+              </w:rPr>
+              <w:t xml:space="preserve"> </w:t>
+            </w:r>
+            <w:proofErr w:type="spellStart"/>
+            <w:r>
+              <w:rPr>
+                <w:rFonts w:ascii="Bookman Old Style" w:eastAsia="Bookman Old Style" w:hAnsi="Bookman Old Style" w:cs="Times New Roman"/>
+                <w:sz w:val="24"/>
+                <w:szCs w:val="24"/>
+              </w:rPr>
+              <w:t>disebut</w:t>
+            </w:r>
+            <w:proofErr w:type="spellEnd"/>
+            <w:r>
+              <w:rPr>
+                <w:rFonts w:ascii="Bookman Old Style" w:eastAsia="Bookman Old Style" w:hAnsi="Bookman Old Style" w:cs="Times New Roman"/>
+                <w:sz w:val="24"/>
+                <w:szCs w:val="24"/>
+              </w:rPr>
+              <w:t xml:space="preserve"> </w:t>
+            </w:r>
+            <w:proofErr w:type="spellStart"/>
+            <w:r>
+              <w:rPr>
+                <w:rFonts w:ascii="Bookman Old Style" w:eastAsia="Bookman Old Style" w:hAnsi="Bookman Old Style" w:cs="Times New Roman"/>
+                <w:sz w:val="24"/>
+                <w:szCs w:val="24"/>
+              </w:rPr>
+              <w:t>sebagai</w:t>
+            </w:r>
+            <w:proofErr w:type="spellEnd"/>
+            <w:r>
+              <w:rPr>
+                <w:rFonts w:ascii="Bookman Old Style" w:eastAsia="Bookman Old Style" w:hAnsi="Bookman Old Style" w:cs="Times New Roman"/>
+                <w:sz w:val="24"/>
+                <w:szCs w:val="24"/>
+              </w:rPr>
+              <w:t xml:space="preserve"> </w:t>
             </w:r>
             <w:r>
               <w:rPr>
@@ -786,6 +1320,7 @@
                 <w:lang w:val="da-DK"/>
               </w:rPr>
             </w:pPr>
+            <w:proofErr w:type="spellStart"/>
             <w:r>
               <w:rPr>
                 <w:rFonts w:ascii="Bookman Old Style" w:eastAsia="Microsoft YaHei UI Light" w:hAnsi="Bookman Old Style" w:cs="Times New Roman"/>
@@ -795,6 +1330,7 @@
               </w:rPr>
               <w:t>Nama</w:t>
             </w:r>
+            <w:proofErr w:type="spellEnd"/>
           </w:p>
         </w:tc>
         <w:tc>
@@ -879,6 +1415,7 @@
                 <w:lang w:val="da-DK"/>
               </w:rPr>
             </w:pPr>
+            <w:proofErr w:type="spellStart"/>
             <w:r>
               <w:rPr>
                 <w:rFonts w:ascii="Bookman Old Style" w:eastAsia="Microsoft YaHei UI Light" w:hAnsi="Bookman Old Style" w:cs="Times New Roman"/>
@@ -888,6 +1425,7 @@
               </w:rPr>
               <w:t>Jabatan</w:t>
             </w:r>
+            <w:proofErr w:type="spellEnd"/>
           </w:p>
         </w:tc>
         <w:tc>
@@ -929,6 +1467,7 @@
                 <w:lang w:val="da-DK"/>
               </w:rPr>
             </w:pPr>
+            <w:proofErr w:type="spellStart"/>
             <w:r>
               <w:rPr>
                 <w:rFonts w:ascii="Bookman Old Style" w:eastAsia="Microsoft YaHei UI Light" w:hAnsi="Bookman Old Style" w:cs="Times New Roman"/>
@@ -936,8 +1475,49 @@
                 <w:szCs w:val="24"/>
                 <w:lang w:val="sv-SE"/>
               </w:rPr>
-              <w:t>Petugas Pendataan Lapangan</w:t>
-            </w:r>
+              <w:t>Petugas</w:t>
+            </w:r>
+            <w:proofErr w:type="spellEnd"/>
+            <w:r>
+              <w:rPr>
+                <w:rFonts w:ascii="Bookman Old Style" w:eastAsia="Microsoft YaHei UI Light" w:hAnsi="Bookman Old Style" w:cs="Times New Roman"/>
+                <w:sz w:val="24"/>
+                <w:szCs w:val="24"/>
+                <w:lang w:val="sv-SE"/>
+              </w:rPr>
+              <w:t xml:space="preserve"> </w:t>
+            </w:r>
+            <w:proofErr w:type="spellStart"/>
+            <w:r>
+              <w:rPr>
+                <w:rFonts w:ascii="Bookman Old Style" w:eastAsia="Microsoft YaHei UI Light" w:hAnsi="Bookman Old Style" w:cs="Times New Roman"/>
+                <w:sz w:val="24"/>
+                <w:szCs w:val="24"/>
+                <w:lang w:val="sv-SE"/>
+              </w:rPr>
+              <w:t>Pendataan</w:t>
+            </w:r>
+            <w:proofErr w:type="spellEnd"/>
+            <w:r>
+              <w:rPr>
+                <w:rFonts w:ascii="Bookman Old Style" w:eastAsia="Microsoft YaHei UI Light" w:hAnsi="Bookman Old Style" w:cs="Times New Roman"/>
+                <w:sz w:val="24"/>
+                <w:szCs w:val="24"/>
+                <w:lang w:val="sv-SE"/>
+              </w:rPr>
+              <w:t xml:space="preserve"> </w:t>
+            </w:r>
+            <w:proofErr w:type="spellStart"/>
+            <w:r>
+              <w:rPr>
+                <w:rFonts w:ascii="Bookman Old Style" w:eastAsia="Microsoft YaHei UI Light" w:hAnsi="Bookman Old Style" w:cs="Times New Roman"/>
+                <w:sz w:val="24"/>
+                <w:szCs w:val="24"/>
+                <w:lang w:val="sv-SE"/>
+              </w:rPr>
+              <w:t>Lapangan</w:t>
+            </w:r>
+            <w:proofErr w:type="spellEnd"/>
           </w:p>
         </w:tc>
       </w:tr>
@@ -976,13 +1556,149 @@
                 <w:szCs w:val="24"/>
               </w:rPr>
             </w:pPr>
+            <w:proofErr w:type="spellStart"/>
             <w:r>
               <w:rPr>
                 <w:rFonts w:ascii="Bookman Old Style" w:eastAsia="Bookman Old Style" w:hAnsi="Bookman Old Style" w:cs="Times New Roman"/>
                 <w:sz w:val="24"/>
                 <w:szCs w:val="24"/>
               </w:rPr>
-              <w:t xml:space="preserve">bertindak untuk dan atas namanya sendiri, selanjutnya disebut sebagai </w:t>
+              <w:t>bertindak</w:t>
+            </w:r>
+            <w:proofErr w:type="spellEnd"/>
+            <w:r>
+              <w:rPr>
+                <w:rFonts w:ascii="Bookman Old Style" w:eastAsia="Bookman Old Style" w:hAnsi="Bookman Old Style" w:cs="Times New Roman"/>
+                <w:sz w:val="24"/>
+                <w:szCs w:val="24"/>
+              </w:rPr>
+              <w:t xml:space="preserve"> </w:t>
+            </w:r>
+            <w:proofErr w:type="spellStart"/>
+            <w:r>
+              <w:rPr>
+                <w:rFonts w:ascii="Bookman Old Style" w:eastAsia="Bookman Old Style" w:hAnsi="Bookman Old Style" w:cs="Times New Roman"/>
+                <w:sz w:val="24"/>
+                <w:szCs w:val="24"/>
+              </w:rPr>
+              <w:t>untuk</w:t>
+            </w:r>
+            <w:proofErr w:type="spellEnd"/>
+            <w:r>
+              <w:rPr>
+                <w:rFonts w:ascii="Bookman Old Style" w:eastAsia="Bookman Old Style" w:hAnsi="Bookman Old Style" w:cs="Times New Roman"/>
+                <w:sz w:val="24"/>
+                <w:szCs w:val="24"/>
+              </w:rPr>
+              <w:t xml:space="preserve"> dan </w:t>
+            </w:r>
+            <w:proofErr w:type="spellStart"/>
+            <w:r>
+              <w:rPr>
+                <w:rFonts w:ascii="Bookman Old Style" w:eastAsia="Bookman Old Style" w:hAnsi="Bookman Old Style" w:cs="Times New Roman"/>
+                <w:sz w:val="24"/>
+                <w:szCs w:val="24"/>
+              </w:rPr>
+              <w:t>atas</w:t>
+            </w:r>
+            <w:proofErr w:type="spellEnd"/>
+            <w:r>
+              <w:rPr>
+                <w:rFonts w:ascii="Bookman Old Style" w:eastAsia="Bookman Old Style" w:hAnsi="Bookman Old Style" w:cs="Times New Roman"/>
+                <w:sz w:val="24"/>
+                <w:szCs w:val="24"/>
+              </w:rPr>
+              <w:t xml:space="preserve"> </w:t>
+            </w:r>
+            <w:proofErr w:type="spellStart"/>
+            <w:r>
+              <w:rPr>
+                <w:rFonts w:ascii="Bookman Old Style" w:eastAsia="Bookman Old Style" w:hAnsi="Bookman Old Style" w:cs="Times New Roman"/>
+                <w:sz w:val="24"/>
+                <w:szCs w:val="24"/>
+              </w:rPr>
+              <w:t>namanya</w:t>
+            </w:r>
+            <w:proofErr w:type="spellEnd"/>
+            <w:r>
+              <w:rPr>
+                <w:rFonts w:ascii="Bookman Old Style" w:eastAsia="Bookman Old Style" w:hAnsi="Bookman Old Style" w:cs="Times New Roman"/>
+                <w:sz w:val="24"/>
+                <w:szCs w:val="24"/>
+              </w:rPr>
+              <w:t xml:space="preserve"> </w:t>
+            </w:r>
+            <w:proofErr w:type="spellStart"/>
+            <w:r>
+              <w:rPr>
+                <w:rFonts w:ascii="Bookman Old Style" w:eastAsia="Bookman Old Style" w:hAnsi="Bookman Old Style" w:cs="Times New Roman"/>
+                <w:sz w:val="24"/>
+                <w:szCs w:val="24"/>
+              </w:rPr>
+              <w:t>sendiri</w:t>
+            </w:r>
+            <w:proofErr w:type="spellEnd"/>
+            <w:r>
+              <w:rPr>
+                <w:rFonts w:ascii="Bookman Old Style" w:eastAsia="Bookman Old Style" w:hAnsi="Bookman Old Style" w:cs="Times New Roman"/>
+                <w:sz w:val="24"/>
+                <w:szCs w:val="24"/>
+              </w:rPr>
+              <w:t xml:space="preserve">, </w:t>
+            </w:r>
+            <w:proofErr w:type="spellStart"/>
+            <w:r>
+              <w:rPr>
+                <w:rFonts w:ascii="Bookman Old Style" w:eastAsia="Bookman Old Style" w:hAnsi="Bookman Old Style" w:cs="Times New Roman"/>
+                <w:sz w:val="24"/>
+                <w:szCs w:val="24"/>
+              </w:rPr>
+              <w:t>selanjutnya</w:t>
+            </w:r>
+            <w:proofErr w:type="spellEnd"/>
+            <w:r>
+              <w:rPr>
+                <w:rFonts w:ascii="Bookman Old Style" w:eastAsia="Bookman Old Style" w:hAnsi="Bookman Old Style" w:cs="Times New Roman"/>
+                <w:sz w:val="24"/>
+                <w:szCs w:val="24"/>
+              </w:rPr>
+              <w:t xml:space="preserve"> </w:t>
+            </w:r>
+            <w:proofErr w:type="spellStart"/>
+            <w:r>
+              <w:rPr>
+                <w:rFonts w:ascii="Bookman Old Style" w:eastAsia="Bookman Old Style" w:hAnsi="Bookman Old Style" w:cs="Times New Roman"/>
+                <w:sz w:val="24"/>
+                <w:szCs w:val="24"/>
+              </w:rPr>
+              <w:t>disebut</w:t>
+            </w:r>
+            <w:proofErr w:type="spellEnd"/>
+            <w:r>
+              <w:rPr>
+                <w:rFonts w:ascii="Bookman Old Style" w:eastAsia="Bookman Old Style" w:hAnsi="Bookman Old Style" w:cs="Times New Roman"/>
+                <w:sz w:val="24"/>
+                <w:szCs w:val="24"/>
+              </w:rPr>
+              <w:t xml:space="preserve"> </w:t>
+            </w:r>
+            <w:proofErr w:type="spellStart"/>
+            <w:r>
+              <w:rPr>
+                <w:rFonts w:ascii="Bookman Old Style" w:eastAsia="Bookman Old Style" w:hAnsi="Bookman Old Style" w:cs="Times New Roman"/>
+                <w:sz w:val="24"/>
+                <w:szCs w:val="24"/>
+              </w:rPr>
+              <w:t>sebagai</w:t>
+            </w:r>
+            <w:proofErr w:type="spellEnd"/>
+            <w:r>
+              <w:rPr>
+                <w:rFonts w:ascii="Bookman Old Style" w:eastAsia="Bookman Old Style" w:hAnsi="Bookman Old Style" w:cs="Times New Roman"/>
+                <w:sz w:val="24"/>
+                <w:szCs w:val="24"/>
+              </w:rPr>
+              <w:t xml:space="preserve"> </w:t>
             </w:r>
             <w:r>
               <w:rPr>
@@ -1027,13 +1743,59 @@
           <w:lang w:val="sv-SE"/>
         </w:rPr>
       </w:pPr>
+      <w:proofErr w:type="spellStart"/>
       <w:r>
         <w:rPr>
           <w:rFonts w:ascii="Bookman Old Style" w:hAnsi="Bookman Old Style"/>
           <w:sz w:val="24"/>
           <w:lang w:val="sv-SE"/>
         </w:rPr>
-        <w:t xml:space="preserve">Dengan ini menyatakan bahwa </w:t>
+        <w:t>Dengan</w:t>
+      </w:r>
+      <w:proofErr w:type="spellEnd"/>
+      <w:r>
+        <w:rPr>
+          <w:rFonts w:ascii="Bookman Old Style" w:hAnsi="Bookman Old Style"/>
+          <w:sz w:val="24"/>
+          <w:lang w:val="sv-SE"/>
+        </w:rPr>
+        <w:t xml:space="preserve"> ini </w:t>
+      </w:r>
+      <w:proofErr w:type="spellStart"/>
+      <w:r>
+        <w:rPr>
+          <w:rFonts w:ascii="Bookman Old Style" w:hAnsi="Bookman Old Style"/>
+          <w:sz w:val="24"/>
+          <w:lang w:val="sv-SE"/>
+        </w:rPr>
+        <w:t>menyatakan</w:t>
+      </w:r>
+      <w:proofErr w:type="spellEnd"/>
+      <w:r>
+        <w:rPr>
+          <w:rFonts w:ascii="Bookman Old Style" w:hAnsi="Bookman Old Style"/>
+          <w:sz w:val="24"/>
+          <w:lang w:val="sv-SE"/>
+        </w:rPr>
+        <w:t xml:space="preserve"> </w:t>
+      </w:r>
+      <w:proofErr w:type="spellStart"/>
+      <w:r>
+        <w:rPr>
+          <w:rFonts w:ascii="Bookman Old Style" w:hAnsi="Bookman Old Style"/>
+          <w:sz w:val="24"/>
+          <w:lang w:val="sv-SE"/>
+        </w:rPr>
+        <w:t>bahwa</w:t>
+      </w:r>
+      <w:proofErr w:type="spellEnd"/>
+      <w:r>
+        <w:rPr>
+          <w:rFonts w:ascii="Bookman Old Style" w:hAnsi="Bookman Old Style"/>
+          <w:sz w:val="24"/>
+          <w:lang w:val="sv-SE"/>
+        </w:rPr>
+        <w:t xml:space="preserve"> </w:t>
       </w:r>
       <w:r>
         <w:rPr>
@@ -1061,7 +1823,34 @@
           <w:sz w:val="24"/>
           <w:lang w:val="sv-SE"/>
         </w:rPr>
-        <w:t xml:space="preserve"> telah me</w:t>
+        <w:t xml:space="preserve"> </w:t>
+      </w:r>
+      <w:proofErr w:type="spellStart"/>
+      <w:r>
+        <w:rPr>
+          <w:rFonts w:ascii="Bookman Old Style" w:hAnsi="Bookman Old Style"/>
+          <w:sz w:val="24"/>
+          <w:lang w:val="sv-SE"/>
+        </w:rPr>
+        <w:t>telah</w:t>
+      </w:r>
+      <w:proofErr w:type="spellEnd"/>
+      <w:r>
+        <w:rPr>
+          <w:rFonts w:ascii="Bookman Old Style" w:hAnsi="Bookman Old Style"/>
+          <w:sz w:val="24"/>
+          <w:lang w:val="sv-SE"/>
+        </w:rPr>
+        <w:t xml:space="preserve"> </w:t>
+      </w:r>
+      <w:proofErr w:type="spellStart"/>
+      <w:r>
+        <w:rPr>
+          <w:rFonts w:ascii="Bookman Old Style" w:hAnsi="Bookman Old Style"/>
+          <w:sz w:val="24"/>
+          <w:lang w:val="sv-SE"/>
+        </w:rPr>
+        <w:t>me</w:t>
       </w:r>
       <w:r>
         <w:rPr>
@@ -1069,7 +1858,34 @@
           <w:sz w:val="24"/>
           <w:lang w:val="id-ID"/>
         </w:rPr>
-        <w:t>nyelesaikan dan menyerahkan dengan baik hasil</w:t>
+        <w:t>nyelesaikan</w:t>
+      </w:r>
+      <w:proofErr w:type="spellEnd"/>
+      <w:r>
+        <w:rPr>
+          <w:rFonts w:ascii="Bookman Old Style" w:hAnsi="Bookman Old Style"/>
+          <w:sz w:val="24"/>
+          <w:lang w:val="id-ID"/>
+        </w:rPr>
+        <w:t xml:space="preserve"> </w:t>
+      </w:r>
+      <w:proofErr w:type="gramStart"/>
+      <w:r>
+        <w:rPr>
+          <w:rFonts w:ascii="Bookman Old Style" w:hAnsi="Bookman Old Style"/>
+          <w:sz w:val="24"/>
+          <w:lang w:val="id-ID"/>
+        </w:rPr>
+        <w:t>dan</w:t>
+      </w:r>
+      <w:proofErr w:type="gramEnd"/>
+      <w:r>
+        <w:rPr>
+          <w:rFonts w:ascii="Bookman Old Style" w:hAnsi="Bookman Old Style"/>
+          <w:sz w:val="24"/>
+          <w:lang w:val="id-ID"/>
+        </w:rPr>
+        <w:t xml:space="preserve"> menyerahkan dengan baik hasil</w:t>
       </w:r>
       <w:r>
         <w:rPr>
@@ -1077,23 +1893,97 @@
           <w:sz w:val="24"/>
           <w:lang w:val="sv-SE"/>
         </w:rPr>
-        <w:t xml:space="preserve"> pekerjaan Pendataan Survei VHTS Bulan </w:t>
-      </w:r>
+        <w:t xml:space="preserve"> </w:t>
+      </w:r>
+      <w:proofErr w:type="spellStart"/>
       <w:r>
         <w:rPr>
           <w:rFonts w:ascii="Bookman Old Style" w:hAnsi="Bookman Old Style"/>
           <w:sz w:val="24"/>
           <w:lang w:val="sv-SE"/>
         </w:rPr>
+        <w:t>pekerjaan</w:t>
+      </w:r>
+      <w:proofErr w:type="spellEnd"/>
+      <w:r>
+        <w:rPr>
+          <w:rFonts w:ascii="Bookman Old Style" w:hAnsi="Bookman Old Style"/>
+          <w:sz w:val="24"/>
+          <w:lang w:val="sv-SE"/>
+        </w:rPr>
+        <w:t xml:space="preserve"> </w:t>
+      </w:r>
+      <w:proofErr w:type="spellStart"/>
+      <w:r>
+        <w:rPr>
+          <w:rFonts w:ascii="Bookman Old Style" w:hAnsi="Bookman Old Style"/>
+          <w:sz w:val="24"/>
+          <w:lang w:val="sv-SE"/>
+        </w:rPr>
+        <w:t>Pendataan</w:t>
+      </w:r>
+      <w:proofErr w:type="spellEnd"/>
+      <w:r>
+        <w:rPr>
+          <w:rFonts w:ascii="Bookman Old Style" w:hAnsi="Bookman Old Style"/>
+          <w:sz w:val="24"/>
+          <w:lang w:val="sv-SE"/>
+        </w:rPr>
+        <w:t xml:space="preserve"> </w:t>
+      </w:r>
+      <w:proofErr w:type="spellStart"/>
+      <w:r>
+        <w:rPr>
+          <w:rFonts w:ascii="Bookman Old Style" w:hAnsi="Bookman Old Style"/>
+          <w:sz w:val="24"/>
+          <w:lang w:val="sv-SE"/>
+        </w:rPr>
+        <w:t>Survei</w:t>
+      </w:r>
+      <w:proofErr w:type="spellEnd"/>
+      <w:r>
+        <w:rPr>
+          <w:rFonts w:ascii="Bookman Old Style" w:hAnsi="Bookman Old Style"/>
+          <w:sz w:val="24"/>
+          <w:lang w:val="sv-SE"/>
+        </w:rPr>
+        <w:t xml:space="preserve"> VHTS Bulan </w:t>
+      </w:r>
+      <w:proofErr w:type="gramStart"/>
+      <w:r>
+        <w:rPr>
+          <w:rFonts w:ascii="Bookman Old Style" w:hAnsi="Bookman Old Style"/>
+          <w:sz w:val="24"/>
+          <w:lang w:val="sv-SE"/>
+        </w:rPr>
         <w:t>Juli</w:t>
       </w:r>
+      <w:proofErr w:type="gramEnd"/>
       <w:r>
         <w:rPr>
           <w:rFonts w:ascii="Bookman Old Style" w:hAnsi="Bookman Old Style"/>
           <w:sz w:val="24"/>
           <w:lang w:val="sv-SE"/>
         </w:rPr>
-        <w:t xml:space="preserve"> Tahun </w:t>
+        <w:t xml:space="preserve"> </w:t>
+      </w:r>
+      <w:proofErr w:type="spellStart"/>
+      <w:r>
+        <w:rPr>
+          <w:rFonts w:ascii="Bookman Old Style" w:hAnsi="Bookman Old Style"/>
+          <w:sz w:val="24"/>
+          <w:lang w:val="sv-SE"/>
+        </w:rPr>
+        <w:t>Tahun</w:t>
+      </w:r>
+      <w:proofErr w:type="spellEnd"/>
+      <w:r>
+        <w:rPr>
+          <w:rFonts w:ascii="Bookman Old Style" w:hAnsi="Bookman Old Style"/>
+          <w:sz w:val="24"/>
+          <w:lang w:val="sv-SE"/>
+        </w:rPr>
+        <w:t xml:space="preserve"> </w:t>
       </w:r>
       <w:r>
         <w:rPr>
@@ -1129,13 +2019,41 @@
         </w:rPr>
         <w:t xml:space="preserve"> </w:t>
       </w:r>
+      <w:proofErr w:type="spellStart"/>
       <w:r>
         <w:rPr>
           <w:rFonts w:ascii="Bookman Old Style" w:hAnsi="Bookman Old Style"/>
           <w:sz w:val="24"/>
           <w:lang w:val="sv-SE"/>
         </w:rPr>
-        <w:t>dengan rincian:</w:t>
+        <w:t>dengan</w:t>
+      </w:r>
+      <w:proofErr w:type="spellEnd"/>
+      <w:r>
+        <w:rPr>
+          <w:rFonts w:ascii="Bookman Old Style" w:hAnsi="Bookman Old Style"/>
+          <w:sz w:val="24"/>
+          <w:lang w:val="sv-SE"/>
+        </w:rPr>
+        <w:t xml:space="preserve"> </w:t>
+      </w:r>
+      <w:proofErr w:type="spellStart"/>
+      <w:r>
+        <w:rPr>
+          <w:rFonts w:ascii="Bookman Old Style" w:hAnsi="Bookman Old Style"/>
+          <w:sz w:val="24"/>
+          <w:lang w:val="sv-SE"/>
+        </w:rPr>
+        <w:t>rincian</w:t>
+      </w:r>
+      <w:proofErr w:type="spellEnd"/>
+      <w:r>
+        <w:rPr>
+          <w:rFonts w:ascii="Bookman Old Style" w:hAnsi="Bookman Old Style"/>
+          <w:sz w:val="24"/>
+          <w:lang w:val="sv-SE"/>
+        </w:rPr>
+        <w:t>:</w:t>
       </w:r>
     </w:p>
     <w:p>
@@ -1265,14 +2183,88 @@
           <w:lang w:val="id-ID"/>
         </w:rPr>
       </w:pPr>
+      <w:proofErr w:type="spellStart"/>
       <w:r>
         <w:rPr>
           <w:rFonts w:ascii="Bookman Old Style" w:hAnsi="Bookman Old Style"/>
           <w:sz w:val="24"/>
           <w:lang w:val="sv-SE"/>
         </w:rPr>
-        <w:t>Demikian Berita Acara Serah Terima</w:t>
-      </w:r>
+        <w:t>Demikian</w:t>
+      </w:r>
+      <w:proofErr w:type="spellEnd"/>
+      <w:r>
+        <w:rPr>
+          <w:rFonts w:ascii="Bookman Old Style" w:hAnsi="Bookman Old Style"/>
+          <w:sz w:val="24"/>
+          <w:lang w:val="sv-SE"/>
+        </w:rPr>
+        <w:t xml:space="preserve"> </w:t>
+      </w:r>
+      <w:proofErr w:type="spellStart"/>
+      <w:r>
+        <w:rPr>
+          <w:rFonts w:ascii="Bookman Old Style" w:hAnsi="Bookman Old Style"/>
+          <w:sz w:val="24"/>
+          <w:lang w:val="sv-SE"/>
+        </w:rPr>
+        <w:t>Berita</w:t>
+      </w:r>
+      <w:proofErr w:type="spellEnd"/>
+      <w:r>
+        <w:rPr>
+          <w:rFonts w:ascii="Bookman Old Style" w:hAnsi="Bookman Old Style"/>
+          <w:sz w:val="24"/>
+          <w:lang w:val="sv-SE"/>
+        </w:rPr>
+        <w:t xml:space="preserve"> </w:t>
+      </w:r>
+      <w:proofErr w:type="spellStart"/>
+      <w:r>
+        <w:rPr>
+          <w:rFonts w:ascii="Bookman Old Style" w:hAnsi="Bookman Old Style"/>
+          <w:sz w:val="24"/>
+          <w:lang w:val="sv-SE"/>
+        </w:rPr>
+        <w:t>Acara</w:t>
+      </w:r>
+      <w:proofErr w:type="spellEnd"/>
+      <w:r>
+        <w:rPr>
+          <w:rFonts w:ascii="Bookman Old Style" w:hAnsi="Bookman Old Style"/>
+          <w:sz w:val="24"/>
+          <w:lang w:val="sv-SE"/>
+        </w:rPr>
+        <w:t xml:space="preserve"> </w:t>
+      </w:r>
+      <w:proofErr w:type="spellStart"/>
+      <w:r>
+        <w:rPr>
+          <w:rFonts w:ascii="Bookman Old Style" w:hAnsi="Bookman Old Style"/>
+          <w:sz w:val="24"/>
+          <w:lang w:val="sv-SE"/>
+        </w:rPr>
+        <w:t>Serah</w:t>
+      </w:r>
+      <w:proofErr w:type="spellEnd"/>
+      <w:r>
+        <w:rPr>
+          <w:rFonts w:ascii="Bookman Old Style" w:hAnsi="Bookman Old Style"/>
+          <w:sz w:val="24"/>
+          <w:lang w:val="sv-SE"/>
+        </w:rPr>
+        <w:t xml:space="preserve"> </w:t>
+      </w:r>
+      <w:proofErr w:type="spellStart"/>
+      <w:r>
+        <w:rPr>
+          <w:rFonts w:ascii="Bookman Old Style" w:hAnsi="Bookman Old Style"/>
+          <w:sz w:val="24"/>
+          <w:lang w:val="sv-SE"/>
+        </w:rPr>
+        <w:t>Terima</w:t>
+      </w:r>
+      <w:proofErr w:type="spellEnd"/>
       <w:r>
         <w:rPr>
           <w:rFonts w:ascii="Bookman Old Style" w:hAnsi="Bookman Old Style"/>
@@ -1287,7 +2279,115 @@
           <w:sz w:val="24"/>
           <w:lang w:val="sv-SE"/>
         </w:rPr>
-        <w:t xml:space="preserve"> ini dibuat untuk dapat dipergunakan sebagaimana semestinya.</w:t>
+        <w:t xml:space="preserve"> ini </w:t>
+      </w:r>
+      <w:proofErr w:type="spellStart"/>
+      <w:r>
+        <w:rPr>
+          <w:rFonts w:ascii="Bookman Old Style" w:hAnsi="Bookman Old Style"/>
+          <w:sz w:val="24"/>
+          <w:lang w:val="sv-SE"/>
+        </w:rPr>
+        <w:t>dibuat</w:t>
+      </w:r>
+      <w:proofErr w:type="spellEnd"/>
+      <w:r>
+        <w:rPr>
+          <w:rFonts w:ascii="Bookman Old Style" w:hAnsi="Bookman Old Style"/>
+          <w:sz w:val="24"/>
+          <w:lang w:val="sv-SE"/>
+        </w:rPr>
+        <w:t xml:space="preserve"> </w:t>
+      </w:r>
+      <w:proofErr w:type="spellStart"/>
+      <w:r>
+        <w:rPr>
+          <w:rFonts w:ascii="Bookman Old Style" w:hAnsi="Bookman Old Style"/>
+          <w:sz w:val="24"/>
+          <w:lang w:val="sv-SE"/>
+        </w:rPr>
+        <w:t>untuk</w:t>
+      </w:r>
+      <w:proofErr w:type="spellEnd"/>
+      <w:r>
+        <w:rPr>
+          <w:rFonts w:ascii="Bookman Old Style" w:hAnsi="Bookman Old Style"/>
+          <w:sz w:val="24"/>
+          <w:lang w:val="sv-SE"/>
+        </w:rPr>
+        <w:t xml:space="preserve"> </w:t>
+      </w:r>
+      <w:proofErr w:type="spellStart"/>
+      <w:r>
+        <w:rPr>
+          <w:rFonts w:ascii="Bookman Old Style" w:hAnsi="Bookman Old Style"/>
+          <w:sz w:val="24"/>
+          <w:lang w:val="sv-SE"/>
+        </w:rPr>
+        <w:t>dapat</w:t>
+      </w:r>
+      <w:proofErr w:type="spellEnd"/>
+      <w:r>
+        <w:rPr>
+          <w:rFonts w:ascii="Bookman Old Style" w:hAnsi="Bookman Old Style"/>
+          <w:sz w:val="24"/>
+          <w:lang w:val="sv-SE"/>
+        </w:rPr>
+        <w:t xml:space="preserve"> </w:t>
+      </w:r>
+      <w:proofErr w:type="spellStart"/>
+      <w:r>
+        <w:rPr>
+          <w:rFonts w:ascii="Bookman Old Style" w:hAnsi="Bookman Old Style"/>
+          <w:sz w:val="24"/>
+          <w:lang w:val="sv-SE"/>
+        </w:rPr>
+        <w:t>dipergunakan</w:t>
+      </w:r>
+      <w:proofErr w:type="spellEnd"/>
+      <w:r>
+        <w:rPr>
+          <w:rFonts w:ascii="Bookman Old Style" w:hAnsi="Bookman Old Style"/>
+          <w:sz w:val="24"/>
+          <w:lang w:val="sv-SE"/>
+        </w:rPr>
+        <w:t xml:space="preserve"> </w:t>
+      </w:r>
+      <w:proofErr w:type="spellStart"/>
+      <w:r>
+        <w:rPr>
+          <w:rFonts w:ascii="Bookman Old Style" w:hAnsi="Bookman Old Style"/>
+          <w:sz w:val="24"/>
+          <w:lang w:val="sv-SE"/>
+        </w:rPr>
+        <w:t>sebagaimana</w:t>
+      </w:r>
+      <w:proofErr w:type="spellEnd"/>
+      <w:r>
+        <w:rPr>
+          <w:rFonts w:ascii="Bookman Old Style" w:hAnsi="Bookman Old Style"/>
+          <w:sz w:val="24"/>
+          <w:lang w:val="sv-SE"/>
+        </w:rPr>
+        <w:t xml:space="preserve"> </w:t>
+      </w:r>
+      <w:proofErr w:type="spellStart"/>
+      <w:r>
+        <w:rPr>
+          <w:rFonts w:ascii="Bookman Old Style" w:hAnsi="Bookman Old Style"/>
+          <w:sz w:val="24"/>
+          <w:lang w:val="sv-SE"/>
+        </w:rPr>
+        <w:t>semestinya</w:t>
+      </w:r>
+      <w:proofErr w:type="spellEnd"/>
+      <w:r>
+        <w:rPr>
+          <w:rFonts w:ascii="Bookman Old Style" w:hAnsi="Bookman Old Style"/>
+          <w:sz w:val="24"/>
+          <w:lang w:val="sv-SE"/>
+        </w:rPr>
+        <w:t>.</w:t>
       </w:r>
     </w:p>
     <w:p>
@@ -1482,8 +2582,19 @@
           <w:szCs w:val="24"/>
           <w:lang w:val="sv-SE"/>
         </w:rPr>
-        <w:t>Andi Syamsul</w:t>
-      </w:r>
+        <w:t xml:space="preserve">Andi </w:t>
+      </w:r>
+      <w:proofErr w:type="spellStart"/>
+      <w:r>
+        <w:rPr>
+          <w:rFonts w:ascii="Bookman Old Style" w:eastAsia="Microsoft YaHei UI Light" w:hAnsi="Bookman Old Style" w:cs="Times New Roman"/>
+          <w:sz w:val="24"/>
+          <w:szCs w:val="24"/>
+          <w:lang w:val="sv-SE"/>
+        </w:rPr>
+        <w:t>Syamsul</w:t>
+      </w:r>
+      <w:proofErr w:type="spellEnd"/>
       <w:r>
         <w:rPr>
           <w:rFonts w:ascii="Bookman Old Style" w:eastAsia="Microsoft YaHei UI Light" w:hAnsi="Bookman Old Style" w:cs="Times New Roman"/>
@@ -1494,8 +2605,21 @@
           <w:lang w:val="it-IT"/>
         </w:rPr>
         <w:tab/>
-        <w:t>Sri Wahyuni, S.Si</w:t>
-      </w:r>
+        <w:t xml:space="preserve">Sri Wahyuni, </w:t>
+      </w:r>
+      <w:proofErr w:type="spellStart"/>
+      <w:r>
+        <w:rPr>
+          <w:rFonts w:ascii="Bookman Old Style" w:eastAsia="Microsoft YaHei UI Light" w:hAnsi="Bookman Old Style" w:cs="Times New Roman"/>
+          <w:color w:val="000000"/>
+          <w:sz w:val="24"/>
+          <w:szCs w:val="24"/>
+          <w:shd w:val="clear" w:color="auto" w:fill="FFFFFF"/>
+          <w:lang w:val="it-IT"/>
+        </w:rPr>
+        <w:t>S.Si</w:t>
+      </w:r>
+      <w:proofErr w:type="spellEnd"/>
     </w:p>
     <w:bookmarkEnd w:id="0"/>
     <w:p>
@@ -1553,1483 +2677,6 @@
           <w:sz w:val="24"/>
           <w:szCs w:val="24"/>
           <w:lang w:val="fi-FI"/>
-        </w:rPr>
-      </w:pPr>
-    </w:p>
-    <w:p>
-      <w:pPr>
-        <w:spacing w:after="0" w:line="276" w:lineRule="auto"/>
-        <w:jc w:val="center"/>
-        <w:rPr>
-          <w:rFonts w:ascii="Bookman Old Style" w:eastAsia="Microsoft YaHei UI Light" w:hAnsi="Bookman Old Style" w:cs="Times New Roman"/>
-          <w:b/>
-          <w:bCs/>
-          <w:sz w:val="24"/>
-          <w:szCs w:val="24"/>
-          <w:lang w:val="fi-FI"/>
-        </w:rPr>
-      </w:pPr>
-      <w:r>
-        <w:rPr>
-          <w:rFonts w:ascii="Bookman Old Style" w:eastAsia="Microsoft YaHei UI Light" w:hAnsi="Bookman Old Style" w:cs="Times New Roman"/>
-          <w:b/>
-          <w:bCs/>
-          <w:sz w:val="24"/>
-          <w:szCs w:val="24"/>
-          <w:lang w:val="fi-FI"/>
-        </w:rPr>
-        <w:lastRenderedPageBreak/>
-        <w:t>BERITA ACARA SERAH TERIMA PEKERJAAN</w:t>
-      </w:r>
-    </w:p>
-    <w:p>
-      <w:pPr>
-        <w:spacing w:after="0" w:line="276" w:lineRule="auto"/>
-        <w:jc w:val="center"/>
-        <w:rPr>
-          <w:rFonts w:ascii="Bookman Old Style" w:eastAsia="Microsoft YaHei UI Light" w:hAnsi="Bookman Old Style" w:cs="Times New Roman"/>
-          <w:b/>
-          <w:bCs/>
-          <w:sz w:val="24"/>
-          <w:szCs w:val="24"/>
-          <w:lang w:val="fi-FI"/>
-        </w:rPr>
-      </w:pPr>
-      <w:r>
-        <w:rPr>
-          <w:rFonts w:ascii="Bookman Old Style" w:eastAsia="Microsoft YaHei UI Light" w:hAnsi="Bookman Old Style" w:cs="Times New Roman"/>
-          <w:b/>
-          <w:bCs/>
-          <w:sz w:val="24"/>
-          <w:szCs w:val="24"/>
-          <w:lang w:val="fi-FI"/>
-        </w:rPr>
-        <w:t xml:space="preserve">SURVEI PERUSAHAAN/USAHA PENYEDIA JASA AKOMODASI (VHTS) </w:t>
-      </w:r>
-    </w:p>
-    <w:p>
-      <w:pPr>
-        <w:spacing w:after="0" w:line="276" w:lineRule="auto"/>
-        <w:jc w:val="center"/>
-        <w:rPr>
-          <w:rFonts w:ascii="Bookman Old Style" w:eastAsia="Microsoft YaHei UI Light" w:hAnsi="Bookman Old Style" w:cs="Times New Roman"/>
-          <w:b/>
-          <w:bCs/>
-          <w:sz w:val="24"/>
-          <w:szCs w:val="24"/>
-          <w:lang w:val="da-DK"/>
-        </w:rPr>
-      </w:pPr>
-      <w:r>
-        <w:rPr>
-          <w:rFonts w:ascii="Bookman Old Style" w:eastAsia="Microsoft YaHei UI Light" w:hAnsi="Bookman Old Style" w:cs="Times New Roman"/>
-          <w:b/>
-          <w:bCs/>
-          <w:sz w:val="24"/>
-          <w:szCs w:val="24"/>
-          <w:lang w:val="da-DK"/>
-        </w:rPr>
-        <w:t xml:space="preserve">BULAN </w:t>
-      </w:r>
-      <w:r>
-        <w:rPr>
-          <w:rFonts w:ascii="Bookman Old Style" w:eastAsia="Microsoft YaHei UI Light" w:hAnsi="Bookman Old Style" w:cs="Times New Roman"/>
-          <w:b/>
-          <w:bCs/>
-          <w:sz w:val="24"/>
-          <w:szCs w:val="24"/>
-          <w:lang w:val="da-DK"/>
-        </w:rPr>
-        <w:t>AGUSTUS</w:t>
-      </w:r>
-      <w:r>
-        <w:rPr>
-          <w:rFonts w:ascii="Bookman Old Style" w:eastAsia="Microsoft YaHei UI Light" w:hAnsi="Bookman Old Style" w:cs="Times New Roman"/>
-          <w:b/>
-          <w:bCs/>
-          <w:sz w:val="24"/>
-          <w:szCs w:val="24"/>
-          <w:lang w:val="da-DK"/>
-        </w:rPr>
-        <w:t xml:space="preserve"> TAHUN 2026</w:t>
-      </w:r>
-    </w:p>
-    <w:p>
-      <w:pPr>
-        <w:spacing w:after="0" w:line="276" w:lineRule="auto"/>
-        <w:jc w:val="center"/>
-        <w:rPr>
-          <w:rFonts w:ascii="Bookman Old Style" w:eastAsia="Microsoft YaHei UI Light" w:hAnsi="Bookman Old Style" w:cs="Times New Roman"/>
-          <w:b/>
-          <w:bCs/>
-          <w:sz w:val="24"/>
-          <w:szCs w:val="24"/>
-          <w:lang w:val="fi-FI"/>
-        </w:rPr>
-      </w:pPr>
-    </w:p>
-    <w:p>
-      <w:pPr>
-        <w:spacing w:after="0" w:line="276" w:lineRule="auto"/>
-        <w:jc w:val="center"/>
-        <w:rPr>
-          <w:rFonts w:ascii="Bookman Old Style" w:eastAsia="Microsoft YaHei UI Light" w:hAnsi="Bookman Old Style" w:cs="Times New Roman"/>
-          <w:sz w:val="24"/>
-          <w:szCs w:val="24"/>
-          <w:lang w:val="da-DK"/>
-        </w:rPr>
-      </w:pPr>
-      <w:r>
-        <w:rPr>
-          <w:rFonts w:ascii="Bookman Old Style" w:eastAsia="Microsoft YaHei UI Light" w:hAnsi="Bookman Old Style" w:cs="Times New Roman"/>
-          <w:sz w:val="24"/>
-          <w:szCs w:val="24"/>
-          <w:lang w:val="da-DK"/>
-        </w:rPr>
-        <w:t xml:space="preserve">NOMOR: </w:t>
-      </w:r>
-      <w:r>
-        <w:rPr>
-          <w:rFonts w:ascii="Bookman Old Style" w:eastAsia="Microsoft YaHei UI Light" w:hAnsi="Bookman Old Style" w:cs="Times New Roman"/>
-          <w:sz w:val="24"/>
-          <w:szCs w:val="24"/>
-        </w:rPr>
-        <w:t>6</w:t>
-      </w:r>
-      <w:r>
-        <w:rPr>
-          <w:rFonts w:ascii="Bookman Old Style" w:eastAsia="Microsoft YaHei UI Light" w:hAnsi="Bookman Old Style" w:cs="Times New Roman"/>
-          <w:sz w:val="24"/>
-          <w:szCs w:val="24"/>
-        </w:rPr>
-        <w:t>9</w:t>
-      </w:r>
-      <w:r>
-        <w:rPr>
-          <w:rFonts w:ascii="Bookman Old Style" w:eastAsia="Microsoft YaHei UI Light" w:hAnsi="Bookman Old Style" w:cs="Times New Roman"/>
-          <w:sz w:val="24"/>
-          <w:szCs w:val="24"/>
-        </w:rPr>
-        <w:t>.</w:t>
-      </w:r>
-      <w:r>
-        <w:rPr>
-          <w:rFonts w:ascii="Bookman Old Style" w:eastAsia="Microsoft YaHei UI Light" w:hAnsi="Bookman Old Style" w:cs="Times New Roman"/>
-          <w:sz w:val="24"/>
-          <w:szCs w:val="24"/>
-        </w:rPr>
-        <w:t>1</w:t>
-      </w:r>
-      <w:r>
-        <w:rPr>
-          <w:rFonts w:ascii="Bookman Old Style" w:eastAsia="Microsoft YaHei UI Light" w:hAnsi="Bookman Old Style" w:cs="Times New Roman"/>
-          <w:sz w:val="24"/>
-          <w:szCs w:val="24"/>
-        </w:rPr>
-        <w:t>/7301/VS.330/2026</w:t>
-      </w:r>
-    </w:p>
-    <w:p>
-      <w:pPr>
-        <w:spacing w:after="0" w:line="276" w:lineRule="auto"/>
-        <w:jc w:val="center"/>
-        <w:rPr>
-          <w:rFonts w:ascii="Bookman Old Style" w:eastAsia="Microsoft YaHei UI Light" w:hAnsi="Bookman Old Style" w:cs="Times New Roman"/>
-          <w:sz w:val="24"/>
-          <w:szCs w:val="24"/>
-          <w:lang w:val="da-DK"/>
-        </w:rPr>
-      </w:pPr>
-    </w:p>
-    <w:p>
-      <w:pPr>
-        <w:spacing w:after="240" w:line="276" w:lineRule="auto"/>
-        <w:ind w:firstLine="567"/>
-        <w:jc w:val="both"/>
-        <w:rPr>
-          <w:rFonts w:ascii="Bookman Old Style" w:eastAsia="Microsoft YaHei UI Light" w:hAnsi="Bookman Old Style" w:cs="Times New Roman"/>
-          <w:sz w:val="24"/>
-          <w:szCs w:val="24"/>
-          <w:lang w:val="da-DK"/>
-        </w:rPr>
-      </w:pPr>
-      <w:r>
-        <w:rPr>
-          <w:rFonts w:ascii="Bookman Old Style" w:eastAsia="Microsoft YaHei UI Light" w:hAnsi="Bookman Old Style" w:cs="Times New Roman"/>
-          <w:sz w:val="24"/>
-          <w:szCs w:val="24"/>
-          <w:lang w:val="da-DK"/>
-        </w:rPr>
-        <w:t xml:space="preserve">Pada hari ini </w:t>
-      </w:r>
-      <w:r>
-        <w:rPr>
-          <w:rFonts w:ascii="Bookman Old Style" w:eastAsia="Microsoft YaHei UI Light" w:hAnsi="Bookman Old Style" w:cs="Times New Roman"/>
-          <w:sz w:val="24"/>
-          <w:szCs w:val="24"/>
-          <w:lang w:val="da-DK"/>
-        </w:rPr>
-        <w:t>kamis</w:t>
-      </w:r>
-      <w:r>
-        <w:rPr>
-          <w:rFonts w:ascii="Bookman Old Style" w:eastAsia="Microsoft YaHei UI Light" w:hAnsi="Bookman Old Style" w:cs="Times New Roman"/>
-          <w:sz w:val="24"/>
-          <w:szCs w:val="24"/>
-          <w:lang w:val="da-DK"/>
-        </w:rPr>
-        <w:t xml:space="preserve">, tanggal dua </w:t>
-      </w:r>
-      <w:r>
-        <w:rPr>
-          <w:rFonts w:ascii="Bookman Old Style" w:eastAsia="Microsoft YaHei UI Light" w:hAnsi="Bookman Old Style" w:cs="Times New Roman"/>
-          <w:sz w:val="24"/>
-          <w:szCs w:val="24"/>
-          <w:lang w:val="da-DK"/>
-        </w:rPr>
-        <w:t xml:space="preserve">puluh </w:t>
-      </w:r>
-      <w:r>
-        <w:rPr>
-          <w:rFonts w:ascii="Bookman Old Style" w:eastAsia="Microsoft YaHei UI Light" w:hAnsi="Bookman Old Style" w:cs="Times New Roman"/>
-          <w:sz w:val="24"/>
-          <w:szCs w:val="24"/>
-          <w:lang w:val="da-DK"/>
-        </w:rPr>
-        <w:t xml:space="preserve">bulan </w:t>
-      </w:r>
-      <w:r>
-        <w:rPr>
-          <w:rFonts w:ascii="Bookman Old Style" w:eastAsia="Microsoft YaHei UI Light" w:hAnsi="Bookman Old Style" w:cs="Times New Roman"/>
-          <w:sz w:val="24"/>
-          <w:szCs w:val="24"/>
-          <w:lang w:val="da-DK"/>
-        </w:rPr>
-        <w:t>agustus</w:t>
-      </w:r>
-      <w:r>
-        <w:rPr>
-          <w:rFonts w:ascii="Bookman Old Style" w:eastAsia="Microsoft YaHei UI Light" w:hAnsi="Bookman Old Style" w:cs="Times New Roman"/>
-          <w:sz w:val="24"/>
-          <w:szCs w:val="24"/>
-          <w:lang w:val="da-DK"/>
-        </w:rPr>
-        <w:t xml:space="preserve"> tahun dua ribu dua puluh enam (20-</w:t>
-      </w:r>
-      <w:r>
-        <w:rPr>
-          <w:rFonts w:ascii="Bookman Old Style" w:eastAsia="Microsoft YaHei UI Light" w:hAnsi="Bookman Old Style" w:cs="Times New Roman"/>
-          <w:sz w:val="24"/>
-          <w:szCs w:val="24"/>
-          <w:lang w:val="da-DK"/>
-        </w:rPr>
-        <w:t>8</w:t>
-      </w:r>
-      <w:r>
-        <w:rPr>
-          <w:rFonts w:ascii="Bookman Old Style" w:eastAsia="Microsoft YaHei UI Light" w:hAnsi="Bookman Old Style" w:cs="Times New Roman"/>
-          <w:sz w:val="24"/>
-          <w:szCs w:val="24"/>
-          <w:lang w:val="da-DK"/>
-        </w:rPr>
-        <w:t>-2026), bertempat di Benteng</w:t>
-      </w:r>
-      <w:r>
-        <w:rPr>
-          <w:rFonts w:ascii="Bookman Old Style" w:eastAsia="Microsoft YaHei UI Light" w:hAnsi="Bookman Old Style" w:cs="Times New Roman"/>
-          <w:b/>
-          <w:bCs/>
-          <w:sz w:val="24"/>
-          <w:szCs w:val="24"/>
-          <w:lang w:val="da-DK"/>
-        </w:rPr>
-        <w:t>,</w:t>
-      </w:r>
-      <w:r>
-        <w:rPr>
-          <w:rFonts w:ascii="Bookman Old Style" w:eastAsia="Microsoft YaHei UI Light" w:hAnsi="Bookman Old Style" w:cs="Times New Roman"/>
-          <w:sz w:val="24"/>
-          <w:szCs w:val="24"/>
-          <w:lang w:val="da-DK"/>
-        </w:rPr>
-        <w:t xml:space="preserve"> kami yang bertanda tangan dibawah ini:</w:t>
-      </w:r>
-    </w:p>
-    <w:tbl>
-      <w:tblPr>
-        <w:tblStyle w:val="TableGrid"/>
-        <w:tblW w:w="0" w:type="auto"/>
-        <w:tblBorders>
-          <w:top w:val="none" w:sz="0" w:space="0" w:color="auto"/>
-          <w:left w:val="none" w:sz="0" w:space="0" w:color="auto"/>
-          <w:bottom w:val="none" w:sz="0" w:space="0" w:color="auto"/>
-          <w:right w:val="none" w:sz="0" w:space="0" w:color="auto"/>
-          <w:insideH w:val="none" w:sz="0" w:space="0" w:color="auto"/>
-          <w:insideV w:val="none" w:sz="0" w:space="0" w:color="auto"/>
-        </w:tblBorders>
-        <w:tblLook w:val="04A0" w:firstRow="1" w:lastRow="0" w:firstColumn="1" w:lastColumn="0" w:noHBand="0" w:noVBand="1"/>
-      </w:tblPr>
-      <w:tblGrid>
-        <w:gridCol w:w="471"/>
-        <w:gridCol w:w="1792"/>
-        <w:gridCol w:w="293"/>
-        <w:gridCol w:w="6789"/>
-      </w:tblGrid>
-      <w:tr>
-        <w:tc>
-          <w:tcPr>
-            <w:tcW w:w="471" w:type="dxa"/>
-            <w:hideMark/>
-          </w:tcPr>
-          <w:p>
-            <w:pPr>
-              <w:spacing w:line="240" w:lineRule="auto"/>
-              <w:rPr>
-                <w:rFonts w:ascii="Bookman Old Style" w:eastAsia="Microsoft YaHei UI Light" w:hAnsi="Bookman Old Style" w:cs="Times New Roman"/>
-                <w:sz w:val="24"/>
-                <w:szCs w:val="24"/>
-                <w:lang w:val="da-DK"/>
-              </w:rPr>
-            </w:pPr>
-            <w:r>
-              <w:rPr>
-                <w:rFonts w:ascii="Bookman Old Style" w:eastAsia="Microsoft YaHei UI Light" w:hAnsi="Bookman Old Style" w:cs="Times New Roman"/>
-                <w:sz w:val="24"/>
-                <w:szCs w:val="24"/>
-                <w:lang w:val="da-DK"/>
-              </w:rPr>
-              <w:t>1.</w:t>
-            </w:r>
-          </w:p>
-        </w:tc>
-        <w:tc>
-          <w:tcPr>
-            <w:tcW w:w="1792" w:type="dxa"/>
-            <w:hideMark/>
-          </w:tcPr>
-          <w:p>
-            <w:pPr>
-              <w:spacing w:line="276" w:lineRule="auto"/>
-              <w:rPr>
-                <w:rFonts w:ascii="Bookman Old Style" w:eastAsia="Microsoft YaHei UI Light" w:hAnsi="Bookman Old Style" w:cs="Times New Roman"/>
-                <w:sz w:val="24"/>
-                <w:szCs w:val="24"/>
-                <w:lang w:val="da-DK"/>
-              </w:rPr>
-            </w:pPr>
-            <w:r>
-              <w:rPr>
-                <w:rFonts w:ascii="Bookman Old Style" w:eastAsia="Microsoft YaHei UI Light" w:hAnsi="Bookman Old Style" w:cs="Times New Roman"/>
-                <w:sz w:val="24"/>
-                <w:szCs w:val="24"/>
-                <w:lang w:val="da-DK"/>
-              </w:rPr>
-              <w:t>Nama</w:t>
-            </w:r>
-          </w:p>
-        </w:tc>
-        <w:tc>
-          <w:tcPr>
-            <w:tcW w:w="293" w:type="dxa"/>
-            <w:hideMark/>
-          </w:tcPr>
-          <w:p>
-            <w:pPr>
-              <w:spacing w:line="276" w:lineRule="auto"/>
-              <w:rPr>
-                <w:rFonts w:ascii="Bookman Old Style" w:eastAsia="Microsoft YaHei UI Light" w:hAnsi="Bookman Old Style" w:cs="Times New Roman"/>
-                <w:sz w:val="24"/>
-                <w:szCs w:val="24"/>
-                <w:lang w:val="da-DK"/>
-              </w:rPr>
-            </w:pPr>
-            <w:r>
-              <w:rPr>
-                <w:rFonts w:ascii="Bookman Old Style" w:eastAsia="Microsoft YaHei UI Light" w:hAnsi="Bookman Old Style" w:cs="Times New Roman"/>
-                <w:sz w:val="24"/>
-                <w:szCs w:val="24"/>
-                <w:lang w:val="da-DK"/>
-              </w:rPr>
-              <w:t>:</w:t>
-            </w:r>
-          </w:p>
-        </w:tc>
-        <w:tc>
-          <w:tcPr>
-            <w:tcW w:w="6789" w:type="dxa"/>
-            <w:hideMark/>
-          </w:tcPr>
-          <w:p>
-            <w:pPr>
-              <w:spacing w:line="276" w:lineRule="auto"/>
-              <w:rPr>
-                <w:rFonts w:ascii="Bookman Old Style" w:eastAsia="Microsoft YaHei UI Light" w:hAnsi="Bookman Old Style" w:cs="Times New Roman"/>
-                <w:sz w:val="24"/>
-                <w:szCs w:val="24"/>
-                <w:lang w:val="da-DK"/>
-              </w:rPr>
-            </w:pPr>
-            <w:r>
-              <w:rPr>
-                <w:rFonts w:ascii="Bookman Old Style" w:eastAsia="Microsoft YaHei UI Light" w:hAnsi="Bookman Old Style" w:cs="Times New Roman"/>
-                <w:sz w:val="24"/>
-                <w:szCs w:val="24"/>
-                <w:lang w:val="sv-SE"/>
-              </w:rPr>
-              <w:t>SRI WAHYUNI, S.Si</w:t>
-            </w:r>
-          </w:p>
-        </w:tc>
-      </w:tr>
-      <w:tr>
-        <w:tc>
-          <w:tcPr>
-            <w:tcW w:w="471" w:type="dxa"/>
-          </w:tcPr>
-          <w:p>
-            <w:pPr>
-              <w:spacing w:line="240" w:lineRule="auto"/>
-              <w:rPr>
-                <w:rFonts w:ascii="Bookman Old Style" w:eastAsia="Microsoft YaHei UI Light" w:hAnsi="Bookman Old Style" w:cs="Times New Roman"/>
-                <w:sz w:val="24"/>
-                <w:szCs w:val="24"/>
-                <w:lang w:val="da-DK"/>
-              </w:rPr>
-            </w:pPr>
-          </w:p>
-        </w:tc>
-        <w:tc>
-          <w:tcPr>
-            <w:tcW w:w="1792" w:type="dxa"/>
-            <w:hideMark/>
-          </w:tcPr>
-          <w:p>
-            <w:pPr>
-              <w:spacing w:line="276" w:lineRule="auto"/>
-              <w:rPr>
-                <w:rFonts w:ascii="Bookman Old Style" w:eastAsia="Microsoft YaHei UI Light" w:hAnsi="Bookman Old Style" w:cs="Times New Roman"/>
-                <w:sz w:val="24"/>
-                <w:szCs w:val="24"/>
-                <w:lang w:val="da-DK"/>
-              </w:rPr>
-            </w:pPr>
-            <w:r>
-              <w:rPr>
-                <w:rFonts w:ascii="Bookman Old Style" w:eastAsia="Microsoft YaHei UI Light" w:hAnsi="Bookman Old Style" w:cs="Times New Roman"/>
-                <w:sz w:val="24"/>
-                <w:szCs w:val="24"/>
-                <w:lang w:val="da-DK"/>
-              </w:rPr>
-              <w:t>NIP</w:t>
-            </w:r>
-          </w:p>
-        </w:tc>
-        <w:tc>
-          <w:tcPr>
-            <w:tcW w:w="293" w:type="dxa"/>
-            <w:hideMark/>
-          </w:tcPr>
-          <w:p>
-            <w:pPr>
-              <w:spacing w:line="276" w:lineRule="auto"/>
-              <w:rPr>
-                <w:rFonts w:ascii="Bookman Old Style" w:eastAsia="Microsoft YaHei UI Light" w:hAnsi="Bookman Old Style" w:cs="Times New Roman"/>
-                <w:sz w:val="24"/>
-                <w:szCs w:val="24"/>
-                <w:lang w:val="da-DK"/>
-              </w:rPr>
-            </w:pPr>
-            <w:r>
-              <w:rPr>
-                <w:rFonts w:ascii="Bookman Old Style" w:eastAsia="Microsoft YaHei UI Light" w:hAnsi="Bookman Old Style" w:cs="Times New Roman"/>
-                <w:sz w:val="24"/>
-                <w:szCs w:val="24"/>
-                <w:lang w:val="da-DK"/>
-              </w:rPr>
-              <w:t>:</w:t>
-            </w:r>
-          </w:p>
-        </w:tc>
-        <w:tc>
-          <w:tcPr>
-            <w:tcW w:w="6789" w:type="dxa"/>
-            <w:hideMark/>
-          </w:tcPr>
-          <w:p>
-            <w:pPr>
-              <w:spacing w:line="276" w:lineRule="auto"/>
-              <w:rPr>
-                <w:rFonts w:ascii="Bookman Old Style" w:eastAsia="Microsoft YaHei UI Light" w:hAnsi="Bookman Old Style" w:cs="Times New Roman"/>
-                <w:sz w:val="24"/>
-                <w:szCs w:val="24"/>
-                <w:lang w:val="da-DK"/>
-              </w:rPr>
-            </w:pPr>
-            <w:r>
-              <w:rPr>
-                <w:rFonts w:ascii="Bookman Old Style" w:eastAsia="Microsoft YaHei UI Light" w:hAnsi="Bookman Old Style" w:cs="Times New Roman"/>
-                <w:sz w:val="24"/>
-                <w:szCs w:val="24"/>
-                <w:lang w:val="sv-SE"/>
-              </w:rPr>
-              <w:t>198409292009022004</w:t>
-            </w:r>
-          </w:p>
-        </w:tc>
-      </w:tr>
-      <w:tr>
-        <w:tc>
-          <w:tcPr>
-            <w:tcW w:w="471" w:type="dxa"/>
-          </w:tcPr>
-          <w:p>
-            <w:pPr>
-              <w:spacing w:line="240" w:lineRule="auto"/>
-              <w:rPr>
-                <w:rFonts w:ascii="Bookman Old Style" w:eastAsia="Microsoft YaHei UI Light" w:hAnsi="Bookman Old Style" w:cs="Times New Roman"/>
-                <w:sz w:val="24"/>
-                <w:szCs w:val="24"/>
-                <w:lang w:val="da-DK"/>
-              </w:rPr>
-            </w:pPr>
-          </w:p>
-        </w:tc>
-        <w:tc>
-          <w:tcPr>
-            <w:tcW w:w="1792" w:type="dxa"/>
-            <w:hideMark/>
-          </w:tcPr>
-          <w:p>
-            <w:pPr>
-              <w:spacing w:line="276" w:lineRule="auto"/>
-              <w:rPr>
-                <w:rFonts w:ascii="Bookman Old Style" w:eastAsia="Microsoft YaHei UI Light" w:hAnsi="Bookman Old Style" w:cs="Times New Roman"/>
-                <w:sz w:val="24"/>
-                <w:szCs w:val="24"/>
-                <w:lang w:val="da-DK"/>
-              </w:rPr>
-            </w:pPr>
-            <w:r>
-              <w:rPr>
-                <w:rFonts w:ascii="Bookman Old Style" w:eastAsia="Microsoft YaHei UI Light" w:hAnsi="Bookman Old Style" w:cs="Times New Roman"/>
-                <w:sz w:val="24"/>
-                <w:szCs w:val="24"/>
-                <w:lang w:val="da-DK"/>
-              </w:rPr>
-              <w:t>Jabatan</w:t>
-            </w:r>
-          </w:p>
-        </w:tc>
-        <w:tc>
-          <w:tcPr>
-            <w:tcW w:w="293" w:type="dxa"/>
-            <w:hideMark/>
-          </w:tcPr>
-          <w:p>
-            <w:pPr>
-              <w:spacing w:line="276" w:lineRule="auto"/>
-              <w:rPr>
-                <w:rFonts w:ascii="Bookman Old Style" w:eastAsia="Microsoft YaHei UI Light" w:hAnsi="Bookman Old Style" w:cs="Times New Roman"/>
-                <w:sz w:val="24"/>
-                <w:szCs w:val="24"/>
-                <w:lang w:val="da-DK"/>
-              </w:rPr>
-            </w:pPr>
-            <w:r>
-              <w:rPr>
-                <w:rFonts w:ascii="Bookman Old Style" w:eastAsia="Microsoft YaHei UI Light" w:hAnsi="Bookman Old Style" w:cs="Times New Roman"/>
-                <w:sz w:val="24"/>
-                <w:szCs w:val="24"/>
-                <w:lang w:val="da-DK"/>
-              </w:rPr>
-              <w:t>:</w:t>
-            </w:r>
-          </w:p>
-        </w:tc>
-        <w:tc>
-          <w:tcPr>
-            <w:tcW w:w="6789" w:type="dxa"/>
-            <w:hideMark/>
-          </w:tcPr>
-          <w:p>
-            <w:pPr>
-              <w:spacing w:line="276" w:lineRule="auto"/>
-              <w:rPr>
-                <w:rFonts w:ascii="Bookman Old Style" w:eastAsia="Microsoft YaHei UI Light" w:hAnsi="Bookman Old Style" w:cs="Times New Roman"/>
-                <w:sz w:val="24"/>
-                <w:szCs w:val="24"/>
-                <w:lang w:val="da-DK"/>
-              </w:rPr>
-            </w:pPr>
-            <w:r>
-              <w:rPr>
-                <w:rFonts w:ascii="Bookman Old Style" w:eastAsia="Microsoft YaHei UI Light" w:hAnsi="Bookman Old Style" w:cs="Times New Roman"/>
-                <w:sz w:val="24"/>
-                <w:szCs w:val="24"/>
-                <w:lang w:val="sv-SE"/>
-              </w:rPr>
-              <w:t>Ketua Tim Statistik Distribusi BPS Kabupaten Kepulauan Selayar</w:t>
-            </w:r>
-          </w:p>
-        </w:tc>
-      </w:tr>
-      <w:tr>
-        <w:tc>
-          <w:tcPr>
-            <w:tcW w:w="471" w:type="dxa"/>
-          </w:tcPr>
-          <w:p>
-            <w:pPr>
-              <w:spacing w:line="240" w:lineRule="auto"/>
-              <w:rPr>
-                <w:rFonts w:ascii="Bookman Old Style" w:eastAsia="Microsoft YaHei UI Light" w:hAnsi="Bookman Old Style" w:cs="Times New Roman"/>
-                <w:sz w:val="24"/>
-                <w:szCs w:val="24"/>
-                <w:lang w:val="da-DK"/>
-              </w:rPr>
-            </w:pPr>
-          </w:p>
-        </w:tc>
-        <w:tc>
-          <w:tcPr>
-            <w:tcW w:w="8874" w:type="dxa"/>
-            <w:gridSpan w:val="3"/>
-          </w:tcPr>
-          <w:p>
-            <w:pPr>
-              <w:spacing w:line="240" w:lineRule="auto"/>
-              <w:rPr>
-                <w:rFonts w:ascii="Bookman Old Style" w:eastAsia="Bookman Old Style" w:hAnsi="Bookman Old Style" w:cs="Times New Roman"/>
-                <w:sz w:val="24"/>
-                <w:szCs w:val="24"/>
-              </w:rPr>
-            </w:pPr>
-            <w:r>
-              <w:rPr>
-                <w:rFonts w:ascii="Bookman Old Style" w:eastAsia="Bookman Old Style" w:hAnsi="Bookman Old Style" w:cs="Times New Roman"/>
-                <w:sz w:val="24"/>
-                <w:szCs w:val="24"/>
-              </w:rPr>
-              <w:t xml:space="preserve">bertindak untuk dan atas nama BPS Kabupaten Kepulauan Selayar, selanjutnya disebut sebagai </w:t>
-            </w:r>
-            <w:r>
-              <w:rPr>
-                <w:rFonts w:ascii="Bookman Old Style" w:eastAsia="Bookman Old Style" w:hAnsi="Bookman Old Style" w:cs="Times New Roman"/>
-                <w:b/>
-                <w:bCs/>
-                <w:sz w:val="24"/>
-                <w:szCs w:val="24"/>
-              </w:rPr>
-              <w:t>PIHAK PERTAMA</w:t>
-            </w:r>
-            <w:r>
-              <w:rPr>
-                <w:rFonts w:ascii="Bookman Old Style" w:eastAsia="Bookman Old Style" w:hAnsi="Bookman Old Style" w:cs="Times New Roman"/>
-                <w:sz w:val="24"/>
-                <w:szCs w:val="24"/>
-              </w:rPr>
-              <w:t>.</w:t>
-            </w:r>
-          </w:p>
-          <w:p>
-            <w:pPr>
-              <w:spacing w:line="240" w:lineRule="auto"/>
-              <w:rPr>
-                <w:rFonts w:ascii="Bookman Old Style" w:eastAsia="Microsoft YaHei UI Light" w:hAnsi="Bookman Old Style" w:cs="Times New Roman"/>
-                <w:sz w:val="24"/>
-                <w:szCs w:val="24"/>
-                <w:lang w:val="sv-SE"/>
-              </w:rPr>
-            </w:pPr>
-          </w:p>
-          <w:p>
-            <w:pPr>
-              <w:spacing w:line="240" w:lineRule="auto"/>
-              <w:jc w:val="center"/>
-              <w:rPr>
-                <w:rFonts w:ascii="Bookman Old Style" w:eastAsia="Microsoft YaHei UI Light" w:hAnsi="Bookman Old Style" w:cs="Times New Roman"/>
-                <w:sz w:val="24"/>
-                <w:szCs w:val="24"/>
-                <w:lang w:val="da-DK"/>
-              </w:rPr>
-            </w:pPr>
-            <w:r>
-              <w:rPr>
-                <w:rFonts w:ascii="Bookman Old Style" w:eastAsia="Microsoft YaHei UI Light" w:hAnsi="Bookman Old Style" w:cs="Times New Roman"/>
-                <w:sz w:val="24"/>
-                <w:szCs w:val="24"/>
-                <w:lang w:val="da-DK"/>
-              </w:rPr>
-              <w:t>dan</w:t>
-            </w:r>
-          </w:p>
-          <w:p>
-            <w:pPr>
-              <w:spacing w:line="240" w:lineRule="auto"/>
-              <w:jc w:val="center"/>
-              <w:rPr>
-                <w:rFonts w:ascii="Bookman Old Style" w:eastAsia="Microsoft YaHei UI Light" w:hAnsi="Bookman Old Style" w:cs="Times New Roman"/>
-                <w:sz w:val="24"/>
-                <w:szCs w:val="24"/>
-                <w:lang w:val="da-DK"/>
-              </w:rPr>
-            </w:pPr>
-          </w:p>
-        </w:tc>
-      </w:tr>
-      <w:tr>
-        <w:tc>
-          <w:tcPr>
-            <w:tcW w:w="471" w:type="dxa"/>
-            <w:hideMark/>
-          </w:tcPr>
-          <w:p>
-            <w:pPr>
-              <w:spacing w:line="240" w:lineRule="auto"/>
-              <w:rPr>
-                <w:rFonts w:ascii="Bookman Old Style" w:eastAsia="Microsoft YaHei UI Light" w:hAnsi="Bookman Old Style" w:cs="Times New Roman"/>
-                <w:sz w:val="24"/>
-                <w:szCs w:val="24"/>
-                <w:lang w:val="da-DK"/>
-              </w:rPr>
-            </w:pPr>
-            <w:r>
-              <w:rPr>
-                <w:rFonts w:ascii="Bookman Old Style" w:eastAsia="Microsoft YaHei UI Light" w:hAnsi="Bookman Old Style" w:cs="Times New Roman"/>
-                <w:sz w:val="24"/>
-                <w:szCs w:val="24"/>
-                <w:lang w:val="da-DK"/>
-              </w:rPr>
-              <w:t>2.</w:t>
-            </w:r>
-          </w:p>
-        </w:tc>
-        <w:tc>
-          <w:tcPr>
-            <w:tcW w:w="1792" w:type="dxa"/>
-            <w:hideMark/>
-          </w:tcPr>
-          <w:p>
-            <w:pPr>
-              <w:spacing w:line="276" w:lineRule="auto"/>
-              <w:rPr>
-                <w:rFonts w:ascii="Bookman Old Style" w:eastAsia="Microsoft YaHei UI Light" w:hAnsi="Bookman Old Style" w:cs="Times New Roman"/>
-                <w:sz w:val="24"/>
-                <w:szCs w:val="24"/>
-                <w:lang w:val="da-DK"/>
-              </w:rPr>
-            </w:pPr>
-            <w:r>
-              <w:rPr>
-                <w:rFonts w:ascii="Bookman Old Style" w:eastAsia="Microsoft YaHei UI Light" w:hAnsi="Bookman Old Style" w:cs="Times New Roman"/>
-                <w:sz w:val="24"/>
-                <w:szCs w:val="24"/>
-                <w:lang w:val="da-DK"/>
-              </w:rPr>
-              <w:t>Nama</w:t>
-            </w:r>
-          </w:p>
-        </w:tc>
-        <w:tc>
-          <w:tcPr>
-            <w:tcW w:w="293" w:type="dxa"/>
-            <w:hideMark/>
-          </w:tcPr>
-          <w:p>
-            <w:pPr>
-              <w:spacing w:line="276" w:lineRule="auto"/>
-              <w:rPr>
-                <w:rFonts w:ascii="Bookman Old Style" w:eastAsia="Microsoft YaHei UI Light" w:hAnsi="Bookman Old Style" w:cs="Times New Roman"/>
-                <w:sz w:val="24"/>
-                <w:szCs w:val="24"/>
-                <w:lang w:val="da-DK"/>
-              </w:rPr>
-            </w:pPr>
-            <w:r>
-              <w:rPr>
-                <w:rFonts w:ascii="Bookman Old Style" w:eastAsia="Microsoft YaHei UI Light" w:hAnsi="Bookman Old Style" w:cs="Times New Roman"/>
-                <w:sz w:val="24"/>
-                <w:szCs w:val="24"/>
-                <w:lang w:val="da-DK"/>
-              </w:rPr>
-              <w:t>:</w:t>
-            </w:r>
-          </w:p>
-        </w:tc>
-        <w:tc>
-          <w:tcPr>
-            <w:tcW w:w="6789" w:type="dxa"/>
-            <w:hideMark/>
-          </w:tcPr>
-          <w:p>
-            <w:pPr>
-              <w:spacing w:line="276" w:lineRule="auto"/>
-              <w:rPr>
-                <w:rFonts w:ascii="Bookman Old Style" w:eastAsia="Microsoft YaHei UI Light" w:hAnsi="Bookman Old Style" w:cs="Times New Roman"/>
-                <w:sz w:val="24"/>
-                <w:szCs w:val="24"/>
-                <w:lang w:val="da-DK"/>
-              </w:rPr>
-            </w:pPr>
-            <w:r>
-              <w:rPr>
-                <w:rFonts w:ascii="Bookman Old Style" w:eastAsia="Microsoft YaHei UI Light" w:hAnsi="Bookman Old Style" w:cs="Times New Roman"/>
-                <w:sz w:val="24"/>
-                <w:szCs w:val="24"/>
-                <w:lang w:val="sv-SE"/>
-              </w:rPr>
-              <w:t>ANDI SYAMSUL</w:t>
-            </w:r>
-          </w:p>
-        </w:tc>
-      </w:tr>
-      <w:tr>
-        <w:tc>
-          <w:tcPr>
-            <w:tcW w:w="471" w:type="dxa"/>
-          </w:tcPr>
-          <w:p>
-            <w:pPr>
-              <w:spacing w:line="240" w:lineRule="auto"/>
-              <w:rPr>
-                <w:rFonts w:ascii="Bookman Old Style" w:eastAsia="Microsoft YaHei UI Light" w:hAnsi="Bookman Old Style" w:cs="Times New Roman"/>
-                <w:sz w:val="24"/>
-                <w:szCs w:val="24"/>
-                <w:lang w:val="da-DK"/>
-              </w:rPr>
-            </w:pPr>
-          </w:p>
-        </w:tc>
-        <w:tc>
-          <w:tcPr>
-            <w:tcW w:w="1792" w:type="dxa"/>
-            <w:hideMark/>
-          </w:tcPr>
-          <w:p>
-            <w:pPr>
-              <w:spacing w:line="276" w:lineRule="auto"/>
-              <w:rPr>
-                <w:rFonts w:ascii="Bookman Old Style" w:eastAsia="Microsoft YaHei UI Light" w:hAnsi="Bookman Old Style" w:cs="Times New Roman"/>
-                <w:sz w:val="24"/>
-                <w:szCs w:val="24"/>
-                <w:lang w:val="da-DK"/>
-              </w:rPr>
-            </w:pPr>
-            <w:r>
-              <w:rPr>
-                <w:rFonts w:ascii="Bookman Old Style" w:eastAsia="Microsoft YaHei UI Light" w:hAnsi="Bookman Old Style" w:cs="Times New Roman"/>
-                <w:sz w:val="24"/>
-                <w:szCs w:val="24"/>
-                <w:lang w:val="da-DK"/>
-              </w:rPr>
-              <w:t>Jabatan</w:t>
-            </w:r>
-          </w:p>
-        </w:tc>
-        <w:tc>
-          <w:tcPr>
-            <w:tcW w:w="293" w:type="dxa"/>
-            <w:hideMark/>
-          </w:tcPr>
-          <w:p>
-            <w:pPr>
-              <w:spacing w:line="276" w:lineRule="auto"/>
-              <w:rPr>
-                <w:rFonts w:ascii="Bookman Old Style" w:eastAsia="Microsoft YaHei UI Light" w:hAnsi="Bookman Old Style" w:cs="Times New Roman"/>
-                <w:sz w:val="24"/>
-                <w:szCs w:val="24"/>
-                <w:lang w:val="da-DK"/>
-              </w:rPr>
-            </w:pPr>
-            <w:r>
-              <w:rPr>
-                <w:rFonts w:ascii="Bookman Old Style" w:eastAsia="Microsoft YaHei UI Light" w:hAnsi="Bookman Old Style" w:cs="Times New Roman"/>
-                <w:sz w:val="24"/>
-                <w:szCs w:val="24"/>
-                <w:lang w:val="da-DK"/>
-              </w:rPr>
-              <w:t>:</w:t>
-            </w:r>
-          </w:p>
-        </w:tc>
-        <w:tc>
-          <w:tcPr>
-            <w:tcW w:w="6789" w:type="dxa"/>
-            <w:hideMark/>
-          </w:tcPr>
-          <w:p>
-            <w:pPr>
-              <w:spacing w:line="276" w:lineRule="auto"/>
-              <w:rPr>
-                <w:rFonts w:ascii="Bookman Old Style" w:eastAsia="Microsoft YaHei UI Light" w:hAnsi="Bookman Old Style" w:cs="Times New Roman"/>
-                <w:sz w:val="24"/>
-                <w:szCs w:val="24"/>
-                <w:lang w:val="da-DK"/>
-              </w:rPr>
-            </w:pPr>
-            <w:r>
-              <w:rPr>
-                <w:rFonts w:ascii="Bookman Old Style" w:eastAsia="Microsoft YaHei UI Light" w:hAnsi="Bookman Old Style" w:cs="Times New Roman"/>
-                <w:sz w:val="24"/>
-                <w:szCs w:val="24"/>
-                <w:lang w:val="sv-SE"/>
-              </w:rPr>
-              <w:t>Petugas Pendataan Lapangan</w:t>
-            </w:r>
-          </w:p>
-        </w:tc>
-      </w:tr>
-      <w:tr>
-        <w:tc>
-          <w:tcPr>
-            <w:tcW w:w="471" w:type="dxa"/>
-          </w:tcPr>
-          <w:p>
-            <w:pPr>
-              <w:spacing w:line="240" w:lineRule="auto"/>
-              <w:rPr>
-                <w:rFonts w:ascii="Bookman Old Style" w:eastAsia="Microsoft YaHei UI Light" w:hAnsi="Bookman Old Style" w:cs="Times New Roman"/>
-                <w:sz w:val="24"/>
-                <w:szCs w:val="24"/>
-                <w:lang w:val="da-DK"/>
-              </w:rPr>
-            </w:pPr>
-          </w:p>
-        </w:tc>
-        <w:tc>
-          <w:tcPr>
-            <w:tcW w:w="8874" w:type="dxa"/>
-            <w:gridSpan w:val="3"/>
-            <w:hideMark/>
-          </w:tcPr>
-          <w:p>
-            <w:pPr>
-              <w:tabs>
-                <w:tab w:val="left" w:pos="284"/>
-              </w:tabs>
-              <w:spacing w:line="240" w:lineRule="auto"/>
-              <w:jc w:val="both"/>
-              <w:rPr>
-                <w:rFonts w:ascii="Bookman Old Style" w:eastAsia="Bookman Old Style" w:hAnsi="Bookman Old Style" w:cs="Times New Roman"/>
-                <w:sz w:val="24"/>
-                <w:szCs w:val="24"/>
-              </w:rPr>
-            </w:pPr>
-            <w:r>
-              <w:rPr>
-                <w:rFonts w:ascii="Bookman Old Style" w:eastAsia="Bookman Old Style" w:hAnsi="Bookman Old Style" w:cs="Times New Roman"/>
-                <w:sz w:val="24"/>
-                <w:szCs w:val="24"/>
-              </w:rPr>
-              <w:t xml:space="preserve">bertindak untuk dan atas namanya sendiri, selanjutnya disebut sebagai </w:t>
-            </w:r>
-            <w:r>
-              <w:rPr>
-                <w:rFonts w:ascii="Bookman Old Style" w:eastAsia="Bookman Old Style" w:hAnsi="Bookman Old Style" w:cs="Times New Roman"/>
-                <w:b/>
-                <w:bCs/>
-                <w:sz w:val="24"/>
-                <w:szCs w:val="24"/>
-              </w:rPr>
-              <w:t>PIHAK KEDUA</w:t>
-            </w:r>
-            <w:r>
-              <w:rPr>
-                <w:rFonts w:ascii="Bookman Old Style" w:eastAsia="Bookman Old Style" w:hAnsi="Bookman Old Style" w:cs="Times New Roman"/>
-                <w:sz w:val="24"/>
-                <w:szCs w:val="24"/>
-              </w:rPr>
-              <w:t>.</w:t>
-            </w:r>
-          </w:p>
-        </w:tc>
-      </w:tr>
-    </w:tbl>
-    <w:p>
-      <w:pPr>
-        <w:spacing w:after="0" w:line="276" w:lineRule="auto"/>
-        <w:rPr>
-          <w:rFonts w:ascii="Bookman Old Style" w:eastAsia="Microsoft YaHei UI Light" w:hAnsi="Bookman Old Style" w:cs="Times New Roman"/>
-          <w:sz w:val="24"/>
-          <w:szCs w:val="24"/>
-          <w:lang w:val="sv-SE"/>
-        </w:rPr>
-      </w:pPr>
-    </w:p>
-    <w:p>
-      <w:pPr>
-        <w:pStyle w:val="BodyText2"/>
-        <w:ind w:firstLine="360"/>
-        <w:rPr>
-          <w:rFonts w:ascii="Bookman Old Style" w:hAnsi="Bookman Old Style"/>
-          <w:sz w:val="24"/>
-          <w:lang w:val="sv-SE"/>
-        </w:rPr>
-      </w:pPr>
-      <w:r>
-        <w:rPr>
-          <w:rFonts w:ascii="Bookman Old Style" w:hAnsi="Bookman Old Style"/>
-          <w:sz w:val="24"/>
-          <w:lang w:val="sv-SE"/>
-        </w:rPr>
-        <w:t xml:space="preserve">Dengan ini menyatakan bahwa </w:t>
-      </w:r>
-      <w:r>
-        <w:rPr>
-          <w:rFonts w:ascii="Bookman Old Style" w:hAnsi="Bookman Old Style"/>
-          <w:b/>
-          <w:bCs/>
-          <w:sz w:val="24"/>
-          <w:lang w:val="sv-SE"/>
-        </w:rPr>
-        <w:t xml:space="preserve">PIHAK </w:t>
-      </w:r>
-      <w:r>
-        <w:rPr>
-          <w:rFonts w:ascii="Bookman Old Style" w:hAnsi="Bookman Old Style"/>
-          <w:b/>
-          <w:bCs/>
-          <w:sz w:val="24"/>
-          <w:lang w:val="id-ID"/>
-        </w:rPr>
-        <w:t>KEDUA</w:t>
-      </w:r>
-      <w:r>
-        <w:rPr>
-          <w:rFonts w:ascii="Bookman Old Style" w:hAnsi="Bookman Old Style"/>
-          <w:sz w:val="24"/>
-          <w:lang w:val="sv-SE"/>
-        </w:rPr>
-        <w:t xml:space="preserve"> telah me</w:t>
-      </w:r>
-      <w:r>
-        <w:rPr>
-          <w:rFonts w:ascii="Bookman Old Style" w:hAnsi="Bookman Old Style"/>
-          <w:sz w:val="24"/>
-          <w:lang w:val="id-ID"/>
-        </w:rPr>
-        <w:t>nyelesaikan dan menyerahkan dengan baik hasil</w:t>
-      </w:r>
-      <w:r>
-        <w:rPr>
-          <w:rFonts w:ascii="Bookman Old Style" w:hAnsi="Bookman Old Style"/>
-          <w:sz w:val="24"/>
-          <w:lang w:val="sv-SE"/>
-        </w:rPr>
-        <w:t xml:space="preserve"> pekerjaan Pendataan Survei VHTS Bulan </w:t>
-      </w:r>
-      <w:r>
-        <w:rPr>
-          <w:rFonts w:ascii="Bookman Old Style" w:hAnsi="Bookman Old Style"/>
-          <w:sz w:val="24"/>
-          <w:lang w:val="sv-SE"/>
-        </w:rPr>
-        <w:t>Agustus</w:t>
-      </w:r>
-      <w:r>
-        <w:rPr>
-          <w:rFonts w:ascii="Bookman Old Style" w:hAnsi="Bookman Old Style"/>
-          <w:sz w:val="24"/>
-          <w:lang w:val="sv-SE"/>
-        </w:rPr>
-        <w:t xml:space="preserve"> Tahun 2026</w:t>
-      </w:r>
-      <w:r>
-        <w:rPr>
-          <w:rFonts w:ascii="Bookman Old Style" w:hAnsi="Bookman Old Style"/>
-          <w:sz w:val="24"/>
-          <w:lang w:val="id-ID"/>
-        </w:rPr>
-        <w:t xml:space="preserve"> kepada </w:t>
-      </w:r>
-      <w:r>
-        <w:rPr>
-          <w:rFonts w:ascii="Bookman Old Style" w:hAnsi="Bookman Old Style"/>
-          <w:b/>
-          <w:bCs/>
-          <w:sz w:val="24"/>
-          <w:lang w:val="id-ID"/>
-        </w:rPr>
-        <w:t>PIHAK PERTAMA</w:t>
-      </w:r>
-      <w:r>
-        <w:rPr>
-          <w:rFonts w:ascii="Bookman Old Style" w:hAnsi="Bookman Old Style"/>
-          <w:sz w:val="24"/>
-          <w:lang w:val="id-ID"/>
-        </w:rPr>
-        <w:t xml:space="preserve"> </w:t>
-      </w:r>
-      <w:r>
-        <w:rPr>
-          <w:rFonts w:ascii="Bookman Old Style" w:hAnsi="Bookman Old Style"/>
-          <w:sz w:val="24"/>
-          <w:lang w:val="sv-SE"/>
-        </w:rPr>
-        <w:t>dengan rincian:</w:t>
-      </w:r>
-    </w:p>
-    <w:p>
-      <w:pPr>
-        <w:pStyle w:val="BodyText2"/>
-        <w:numPr>
-          <w:ilvl w:val="0"/>
-          <w:numId w:val="27"/>
-        </w:numPr>
-        <w:rPr>
-          <w:rFonts w:ascii="Bookman Old Style" w:hAnsi="Bookman Old Style"/>
-          <w:sz w:val="24"/>
-          <w:lang w:val="sv-SE"/>
-        </w:rPr>
-      </w:pPr>
-      <w:r>
-        <w:rPr>
-          <w:rFonts w:ascii="Bookman Old Style" w:hAnsi="Bookman Old Style"/>
-          <w:sz w:val="24"/>
-          <w:lang w:val="sv-SE"/>
-        </w:rPr>
-        <w:t>TARGET DOKUMEN</w:t>
-      </w:r>
-      <w:r>
-        <w:rPr>
-          <w:rFonts w:ascii="Bookman Old Style" w:hAnsi="Bookman Old Style"/>
-          <w:sz w:val="24"/>
-          <w:lang w:val="sv-SE"/>
-        </w:rPr>
-        <w:tab/>
-      </w:r>
-      <w:r>
-        <w:rPr>
-          <w:rFonts w:ascii="Bookman Old Style" w:hAnsi="Bookman Old Style"/>
-          <w:sz w:val="24"/>
-          <w:lang w:val="sv-SE"/>
-        </w:rPr>
-        <w:tab/>
-        <w:t xml:space="preserve">: </w:t>
-      </w:r>
-      <w:r>
-        <w:rPr>
-          <w:rFonts w:ascii="Bookman Old Style" w:hAnsi="Bookman Old Style"/>
-          <w:sz w:val="24"/>
-          <w:lang w:val="en-US"/>
-        </w:rPr>
-        <w:t>43 SAMPEL</w:t>
-      </w:r>
-    </w:p>
-    <w:p>
-      <w:pPr>
-        <w:pStyle w:val="BodyText2"/>
-        <w:numPr>
-          <w:ilvl w:val="0"/>
-          <w:numId w:val="27"/>
-        </w:numPr>
-        <w:rPr>
-          <w:rFonts w:ascii="Bookman Old Style" w:hAnsi="Bookman Old Style"/>
-          <w:sz w:val="24"/>
-          <w:lang w:val="sv-SE"/>
-        </w:rPr>
-      </w:pPr>
-      <w:r>
-        <w:rPr>
-          <w:rFonts w:ascii="Bookman Old Style" w:hAnsi="Bookman Old Style"/>
-          <w:sz w:val="24"/>
-          <w:lang w:val="sv-SE"/>
-        </w:rPr>
-        <w:t>REALISASI DOKUMEN</w:t>
-      </w:r>
-      <w:r>
-        <w:rPr>
-          <w:rFonts w:ascii="Bookman Old Style" w:hAnsi="Bookman Old Style"/>
-          <w:sz w:val="24"/>
-          <w:lang w:val="sv-SE"/>
-        </w:rPr>
-        <w:tab/>
-      </w:r>
-      <w:r>
-        <w:rPr>
-          <w:rFonts w:ascii="Bookman Old Style" w:hAnsi="Bookman Old Style"/>
-          <w:sz w:val="24"/>
-          <w:lang w:val="sv-SE"/>
-        </w:rPr>
-        <w:tab/>
-        <w:t xml:space="preserve">: </w:t>
-      </w:r>
-      <w:r>
-        <w:rPr>
-          <w:rFonts w:ascii="Bookman Old Style" w:hAnsi="Bookman Old Style"/>
-          <w:sz w:val="24"/>
-          <w:lang w:val="en-US"/>
-        </w:rPr>
-        <w:t>43 SAMPEL</w:t>
-      </w:r>
-    </w:p>
-    <w:p>
-      <w:pPr>
-        <w:pStyle w:val="BodyText2"/>
-        <w:ind w:firstLine="360"/>
-        <w:rPr>
-          <w:rFonts w:ascii="Bookman Old Style" w:hAnsi="Bookman Old Style"/>
-          <w:sz w:val="24"/>
-          <w:lang w:val="id-ID"/>
-        </w:rPr>
-      </w:pPr>
-      <w:r>
-        <w:rPr>
-          <w:rFonts w:ascii="Bookman Old Style" w:hAnsi="Bookman Old Style"/>
-          <w:sz w:val="24"/>
-          <w:lang w:val="sv-SE"/>
-        </w:rPr>
-        <w:t>Demikian Berita Acara Serah Terima</w:t>
-      </w:r>
-      <w:r>
-        <w:rPr>
-          <w:rFonts w:ascii="Bookman Old Style" w:hAnsi="Bookman Old Style"/>
-          <w:sz w:val="24"/>
-          <w:lang w:val="id-ID"/>
-        </w:rPr>
-        <w:t xml:space="preserve"> Hasil Pekerjaan</w:t>
-      </w:r>
-      <w:r>
-        <w:rPr>
-          <w:rFonts w:ascii="Bookman Old Style" w:hAnsi="Bookman Old Style"/>
-          <w:sz w:val="24"/>
-          <w:lang w:val="sv-SE"/>
-        </w:rPr>
-        <w:t xml:space="preserve"> ini dibuat untuk dapat dipergunakan sebagaimana semestinya.</w:t>
-      </w:r>
-    </w:p>
-    <w:p>
-      <w:pPr>
-        <w:spacing w:after="0" w:line="276" w:lineRule="auto"/>
-        <w:rPr>
-          <w:rFonts w:ascii="Bookman Old Style" w:eastAsia="Microsoft YaHei UI Light" w:hAnsi="Bookman Old Style" w:cs="Times New Roman"/>
-          <w:sz w:val="24"/>
-          <w:szCs w:val="24"/>
-          <w:lang w:val="sv-SE"/>
-        </w:rPr>
-      </w:pPr>
-    </w:p>
-    <w:p>
-      <w:pPr>
-        <w:tabs>
-          <w:tab w:val="center" w:pos="1701"/>
-          <w:tab w:val="center" w:pos="7088"/>
-        </w:tabs>
-        <w:spacing w:after="0" w:line="276" w:lineRule="auto"/>
-        <w:rPr>
-          <w:rFonts w:ascii="Bookman Old Style" w:eastAsia="Microsoft YaHei UI Light" w:hAnsi="Bookman Old Style" w:cs="Times New Roman"/>
-          <w:color w:val="000000"/>
-          <w:sz w:val="24"/>
-          <w:szCs w:val="24"/>
-          <w:shd w:val="clear" w:color="auto" w:fill="FFFFFF"/>
-          <w:lang w:val="it-IT"/>
-        </w:rPr>
-      </w:pPr>
-      <w:r>
-        <w:rPr>
-          <w:rFonts w:ascii="Bookman Old Style" w:eastAsia="Microsoft YaHei UI Light" w:hAnsi="Bookman Old Style" w:cs="Times New Roman"/>
-          <w:color w:val="000000"/>
-          <w:sz w:val="24"/>
-          <w:szCs w:val="24"/>
-          <w:shd w:val="clear" w:color="auto" w:fill="FFFFFF"/>
-          <w:lang w:val="sv-SE"/>
-        </w:rPr>
-        <w:tab/>
-      </w:r>
-    </w:p>
-    <w:p>
-      <w:pPr>
-        <w:tabs>
-          <w:tab w:val="center" w:pos="1701"/>
-          <w:tab w:val="center" w:pos="7088"/>
-        </w:tabs>
-        <w:spacing w:after="0" w:line="276" w:lineRule="auto"/>
-        <w:rPr>
-          <w:rFonts w:ascii="Bookman Old Style" w:eastAsia="Microsoft YaHei UI Light" w:hAnsi="Bookman Old Style" w:cs="Times New Roman"/>
-          <w:color w:val="000000"/>
-          <w:sz w:val="24"/>
-          <w:szCs w:val="24"/>
-          <w:shd w:val="clear" w:color="auto" w:fill="FFFFFF"/>
-          <w:lang w:val="it-IT"/>
-        </w:rPr>
-      </w:pPr>
-    </w:p>
-    <w:p>
-      <w:pPr>
-        <w:tabs>
-          <w:tab w:val="center" w:pos="1701"/>
-          <w:tab w:val="center" w:pos="7088"/>
-        </w:tabs>
-        <w:spacing w:after="0" w:line="276" w:lineRule="auto"/>
-        <w:rPr>
-          <w:rFonts w:ascii="Bookman Old Style" w:eastAsia="Microsoft YaHei UI Light" w:hAnsi="Bookman Old Style" w:cs="Times New Roman"/>
-          <w:color w:val="000000"/>
-          <w:sz w:val="24"/>
-          <w:szCs w:val="24"/>
-          <w:shd w:val="clear" w:color="auto" w:fill="FFFFFF"/>
-          <w:lang w:val="it-IT"/>
-        </w:rPr>
-      </w:pPr>
-      <w:r>
-        <w:rPr>
-          <w:rFonts w:ascii="Bookman Old Style" w:eastAsia="Microsoft YaHei UI Light" w:hAnsi="Bookman Old Style" w:cs="Times New Roman"/>
-          <w:color w:val="000000"/>
-          <w:sz w:val="24"/>
-          <w:szCs w:val="24"/>
-          <w:shd w:val="clear" w:color="auto" w:fill="FFFFFF"/>
-          <w:lang w:val="it-IT"/>
-        </w:rPr>
-        <w:tab/>
-        <w:t>PIHAK KEDUA,</w:t>
-      </w:r>
-      <w:r>
-        <w:rPr>
-          <w:rFonts w:ascii="Bookman Old Style" w:eastAsia="Microsoft YaHei UI Light" w:hAnsi="Bookman Old Style" w:cs="Times New Roman"/>
-          <w:color w:val="000000"/>
-          <w:sz w:val="24"/>
-          <w:szCs w:val="24"/>
-          <w:shd w:val="clear" w:color="auto" w:fill="FFFFFF"/>
-          <w:lang w:val="it-IT"/>
-        </w:rPr>
-        <w:tab/>
-        <w:t>PIHAK PERTAMA,</w:t>
-      </w:r>
-    </w:p>
-    <w:p>
-      <w:pPr>
-        <w:tabs>
-          <w:tab w:val="center" w:pos="1701"/>
-          <w:tab w:val="center" w:pos="7088"/>
-        </w:tabs>
-        <w:spacing w:after="0" w:line="276" w:lineRule="auto"/>
-        <w:rPr>
-          <w:rFonts w:ascii="Bookman Old Style" w:eastAsia="Microsoft YaHei UI Light" w:hAnsi="Bookman Old Style" w:cs="Times New Roman"/>
-          <w:color w:val="000000"/>
-          <w:sz w:val="24"/>
-          <w:szCs w:val="24"/>
-          <w:shd w:val="clear" w:color="auto" w:fill="FFFFFF"/>
-          <w:lang w:val="it-IT"/>
-        </w:rPr>
-      </w:pPr>
-    </w:p>
-    <w:p>
-      <w:pPr>
-        <w:tabs>
-          <w:tab w:val="center" w:pos="1701"/>
-          <w:tab w:val="center" w:pos="7088"/>
-        </w:tabs>
-        <w:spacing w:after="0" w:line="276" w:lineRule="auto"/>
-        <w:rPr>
-          <w:rFonts w:ascii="Bookman Old Style" w:eastAsia="Microsoft YaHei UI Light" w:hAnsi="Bookman Old Style" w:cs="Times New Roman"/>
-          <w:color w:val="000000"/>
-          <w:sz w:val="24"/>
-          <w:szCs w:val="24"/>
-          <w:shd w:val="clear" w:color="auto" w:fill="FFFFFF"/>
-          <w:lang w:val="it-IT"/>
-        </w:rPr>
-      </w:pPr>
-      <w:r>
-        <w:rPr>
-          <w:rFonts w:ascii="Bookman Old Style" w:eastAsia="Microsoft YaHei UI Light" w:hAnsi="Bookman Old Style" w:cs="Times New Roman"/>
-          <w:color w:val="000000"/>
-          <w:sz w:val="24"/>
-          <w:szCs w:val="24"/>
-          <w:shd w:val="clear" w:color="auto" w:fill="FFFFFF"/>
-          <w:lang w:val="it-IT"/>
-        </w:rPr>
-        <w:tab/>
-      </w:r>
-      <w:r>
-        <w:rPr>
-          <w:rFonts w:ascii="Bookman Old Style" w:eastAsia="Microsoft YaHei UI Light" w:hAnsi="Bookman Old Style" w:cs="Times New Roman"/>
-          <w:color w:val="000000"/>
-          <w:sz w:val="24"/>
-          <w:szCs w:val="24"/>
-          <w:shd w:val="clear" w:color="auto" w:fill="FFFFFF"/>
-          <w:lang w:val="it-IT"/>
-        </w:rPr>
-        <w:tab/>
-      </w:r>
-    </w:p>
-    <w:p>
-      <w:pPr>
-        <w:tabs>
-          <w:tab w:val="center" w:pos="1701"/>
-          <w:tab w:val="center" w:pos="7088"/>
-        </w:tabs>
-        <w:spacing w:after="0" w:line="276" w:lineRule="auto"/>
-        <w:rPr>
-          <w:rFonts w:ascii="Bookman Old Style" w:eastAsia="Microsoft YaHei UI Light" w:hAnsi="Bookman Old Style" w:cs="Times New Roman"/>
-          <w:color w:val="000000"/>
-          <w:sz w:val="24"/>
-          <w:szCs w:val="24"/>
-          <w:shd w:val="clear" w:color="auto" w:fill="FFFFFF"/>
-          <w:lang w:val="it-IT"/>
-        </w:rPr>
-      </w:pPr>
-    </w:p>
-    <w:p>
-      <w:pPr>
-        <w:tabs>
-          <w:tab w:val="center" w:pos="1701"/>
-          <w:tab w:val="center" w:pos="7088"/>
-        </w:tabs>
-        <w:spacing w:after="0" w:line="276" w:lineRule="auto"/>
-        <w:rPr>
-          <w:rFonts w:ascii="Bookman Old Style" w:eastAsia="Microsoft YaHei UI Light" w:hAnsi="Bookman Old Style" w:cs="Times New Roman"/>
-          <w:color w:val="000000"/>
-          <w:sz w:val="24"/>
-          <w:szCs w:val="24"/>
-          <w:shd w:val="clear" w:color="auto" w:fill="FFFFFF"/>
-          <w:lang w:val="it-IT"/>
-        </w:rPr>
-      </w:pPr>
-      <w:r>
-        <w:rPr>
-          <w:rFonts w:ascii="Bookman Old Style" w:eastAsia="Microsoft YaHei UI Light" w:hAnsi="Bookman Old Style" w:cs="Times New Roman"/>
-          <w:color w:val="000000"/>
-          <w:sz w:val="24"/>
-          <w:szCs w:val="24"/>
-          <w:shd w:val="clear" w:color="auto" w:fill="FFFFFF"/>
-          <w:lang w:val="it-IT"/>
-        </w:rPr>
-        <w:tab/>
-      </w:r>
-      <w:r>
-        <w:rPr>
-          <w:rFonts w:ascii="Bookman Old Style" w:eastAsia="Microsoft YaHei UI Light" w:hAnsi="Bookman Old Style" w:cs="Times New Roman"/>
-          <w:sz w:val="24"/>
-          <w:szCs w:val="24"/>
-          <w:lang w:val="sv-SE"/>
-        </w:rPr>
-        <w:t>Andi Syamsul</w:t>
-      </w:r>
-      <w:r>
-        <w:rPr>
-          <w:rFonts w:ascii="Bookman Old Style" w:eastAsia="Microsoft YaHei UI Light" w:hAnsi="Bookman Old Style" w:cs="Times New Roman"/>
-          <w:color w:val="000000"/>
-          <w:sz w:val="24"/>
-          <w:szCs w:val="24"/>
-          <w:shd w:val="clear" w:color="auto" w:fill="FFFFFF"/>
-          <w:lang w:val="it-IT"/>
-        </w:rPr>
-        <w:tab/>
-        <w:t>Sri Wahyuni, S.Si</w:t>
-      </w:r>
-    </w:p>
-    <w:p>
-      <w:pPr>
-        <w:tabs>
-          <w:tab w:val="left" w:pos="5670"/>
-        </w:tabs>
-        <w:spacing w:after="0" w:line="276" w:lineRule="auto"/>
-        <w:rPr>
-          <w:rFonts w:ascii="Bookman Old Style" w:eastAsia="Microsoft YaHei UI Light" w:hAnsi="Bookman Old Style" w:cs="Times New Roman"/>
-          <w:color w:val="000000"/>
-          <w:sz w:val="24"/>
-          <w:szCs w:val="24"/>
-          <w:shd w:val="clear" w:color="auto" w:fill="FFFFFF"/>
-          <w:lang w:val="it-IT"/>
         </w:rPr>
       </w:pPr>
     </w:p>
@@ -3252,6 +2899,7 @@
         <w:szCs w:val="20"/>
       </w:rPr>
     </w:pPr>
+    <w:proofErr w:type="spellStart"/>
     <w:r>
       <w:rPr>
         <w:rFonts w:ascii="Arial" w:eastAsia="Arial" w:hAnsi="Arial" w:cs="Arial"/>
@@ -3259,7 +2907,57 @@
         <w:szCs w:val="20"/>
         <w:lang w:val="it-IT"/>
       </w:rPr>
-      <w:t xml:space="preserve">Jl. RE Martadinata No. 05, Kode Pos 92812 Telp. </w:t>
+      <w:t>Jl</w:t>
+    </w:r>
+    <w:proofErr w:type="spellEnd"/>
+    <w:r>
+      <w:rPr>
+        <w:rFonts w:ascii="Arial" w:eastAsia="Arial" w:hAnsi="Arial" w:cs="Arial"/>
+        <w:sz w:val="20"/>
+        <w:szCs w:val="20"/>
+        <w:lang w:val="it-IT"/>
+      </w:rPr>
+      <w:t xml:space="preserve">. RE </w:t>
+    </w:r>
+    <w:proofErr w:type="spellStart"/>
+    <w:r>
+      <w:rPr>
+        <w:rFonts w:ascii="Arial" w:eastAsia="Arial" w:hAnsi="Arial" w:cs="Arial"/>
+        <w:sz w:val="20"/>
+        <w:szCs w:val="20"/>
+        <w:lang w:val="it-IT"/>
+      </w:rPr>
+      <w:t>Martadinata</w:t>
+    </w:r>
+    <w:proofErr w:type="spellEnd"/>
+    <w:r>
+      <w:rPr>
+        <w:rFonts w:ascii="Arial" w:eastAsia="Arial" w:hAnsi="Arial" w:cs="Arial"/>
+        <w:sz w:val="20"/>
+        <w:szCs w:val="20"/>
+        <w:lang w:val="it-IT"/>
+      </w:rPr>
+      <w:t xml:space="preserve"> No. 05, Kode Pos 92812 </w:t>
+    </w:r>
+    <w:proofErr w:type="spellStart"/>
+    <w:r>
+      <w:rPr>
+        <w:rFonts w:ascii="Arial" w:eastAsia="Arial" w:hAnsi="Arial" w:cs="Arial"/>
+        <w:sz w:val="20"/>
+        <w:szCs w:val="20"/>
+        <w:lang w:val="it-IT"/>
+      </w:rPr>
+      <w:t>Telp</w:t>
+    </w:r>
+    <w:proofErr w:type="spellEnd"/>
+    <w:r>
+      <w:rPr>
+        <w:rFonts w:ascii="Arial" w:eastAsia="Arial" w:hAnsi="Arial" w:cs="Arial"/>
+        <w:sz w:val="20"/>
+        <w:szCs w:val="20"/>
+        <w:lang w:val="it-IT"/>
+      </w:rPr>
+      <w:t xml:space="preserve">. </w:t>
     </w:r>
     <w:r>
       <w:rPr>

</xml_diff>